<commit_message>
Update report verification chapter with Vivado waveforms
</commit_message>
<xml_diff>
--- a/03_PROJEKAT_RISCV_VHDL_ZBB/output/projektna_dokumentacija_rv32im_zbb.docx
+++ b/03_PROJEKAT_RISCV_VHDL_ZBB/output/projektna_dokumentacija_rv32im_zbb.docx
@@ -4,10 +4,7 @@
   <w:body>
     <w:p>
       <w:pPr>
-        <w:spacing w:after="60" w:before="0" w:line="240" w:lineRule="auto"/>
-        <w:rPr>
-          <w:rFonts w:hint="eastAsia"/>
-        </w:rPr>
+        <w:spacing w:after="60" w:line="240" w:lineRule="auto"/>
       </w:pPr>
       <w:r>
         <w:rPr>
@@ -24,18 +21,12 @@
           <w:bottom w:val="single" w:sz="8" w:space="1" w:color="5B8CC0"/>
         </w:pBdr>
         <w:spacing w:after="360"/>
-        <w:rPr>
-          <w:rFonts w:hint="eastAsia"/>
-        </w:rPr>
       </w:pPr>
     </w:p>
     <w:p>
       <w:pPr>
         <w:keepNext/>
-        <w:spacing w:before="0" w:after="60" w:line="240" w:lineRule="auto"/>
-        <w:rPr>
-          <w:rFonts w:hint="eastAsia"/>
-        </w:rPr>
+        <w:spacing w:after="60" w:line="240" w:lineRule="auto"/>
       </w:pPr>
       <w:r>
         <w:rPr>
@@ -49,43 +40,83 @@
     </w:p>
     <w:p>
       <w:pPr>
-        <w:spacing w:after="60" w:before="0" w:line="240" w:lineRule="auto"/>
+        <w:spacing w:after="60" w:line="240" w:lineRule="auto"/>
         <w:ind w:left="280" w:hanging="160"/>
-        <w:rPr>
-          <w:rFonts w:hint="eastAsia"/>
-        </w:rPr>
       </w:pPr>
       <w:r>
         <w:rPr>
           <w:rFonts w:eastAsia="Georgia"/>
           <w:sz w:val="20"/>
         </w:rPr>
-        <w:t>- prosiriti polazni single-cycle RV32I procesor iz laboratorijske vjezbe 2</w:t>
+        <w:t xml:space="preserve">- prosiriti polazni single-cycle RV32I procesor </w:t>
+      </w:r>
+      <w:r>
+        <w:rPr>
+          <w:rFonts w:eastAsia="Georgia"/>
+          <w:sz w:val="20"/>
+        </w:rPr>
+        <w:t>(</w:t>
+      </w:r>
+      <w:r>
+        <w:rPr>
+          <w:rFonts w:eastAsia="Georgia"/>
+          <w:sz w:val="20"/>
+        </w:rPr>
+        <w:t>lab</w:t>
+      </w:r>
+      <w:r>
+        <w:rPr>
+          <w:rFonts w:eastAsia="Georgia"/>
+          <w:sz w:val="20"/>
+        </w:rPr>
+        <w:t>.</w:t>
+      </w:r>
+      <w:r>
+        <w:rPr>
+          <w:rFonts w:eastAsia="Georgia"/>
+          <w:sz w:val="20"/>
+        </w:rPr>
+        <w:t xml:space="preserve"> vjezb</w:t>
+      </w:r>
+      <w:r>
+        <w:rPr>
+          <w:rFonts w:eastAsia="Georgia"/>
+          <w:sz w:val="20"/>
+        </w:rPr>
+        <w:t>a</w:t>
+      </w:r>
+      <w:r>
+        <w:rPr>
+          <w:rFonts w:eastAsia="Georgia"/>
+          <w:sz w:val="20"/>
+        </w:rPr>
+        <w:t xml:space="preserve"> 2</w:t>
+      </w:r>
+      <w:r>
+        <w:rPr>
+          <w:rFonts w:eastAsia="Georgia"/>
+          <w:sz w:val="20"/>
+        </w:rPr>
+        <w:t>)</w:t>
       </w:r>
     </w:p>
     <w:p>
       <w:pPr>
-        <w:spacing w:after="60" w:before="0" w:line="240" w:lineRule="auto"/>
+        <w:spacing w:after="60" w:line="240" w:lineRule="auto"/>
         <w:ind w:left="280" w:hanging="160"/>
-        <w:rPr>
-          <w:rFonts w:hint="eastAsia"/>
-        </w:rPr>
       </w:pPr>
       <w:r>
         <w:rPr>
           <w:rFonts w:eastAsia="Georgia"/>
           <w:sz w:val="20"/>
         </w:rPr>
-        <w:t>- dodati nedostajuce RV32I instrukcije koje prirodno pripadaju istoj arhitekturi</w:t>
+        <w:t>- dodati nedostajuce RV32I instrukcije koje pripadaju istoj arhitekturi</w:t>
       </w:r>
     </w:p>
     <w:p>
       <w:pPr>
-        <w:spacing w:after="60" w:before="0" w:line="240" w:lineRule="auto"/>
+        <w:spacing w:after="60" w:line="240" w:lineRule="auto"/>
         <w:ind w:left="280" w:hanging="160"/>
-        <w:rPr>
-          <w:rFonts w:hint="eastAsia"/>
-        </w:rPr>
       </w:pPr>
       <w:r>
         <w:rPr>
@@ -97,11 +128,8 @@
     </w:p>
     <w:p>
       <w:pPr>
-        <w:spacing w:after="60" w:before="0" w:line="240" w:lineRule="auto"/>
+        <w:spacing w:after="60" w:line="240" w:lineRule="auto"/>
         <w:ind w:left="280" w:hanging="160"/>
-        <w:rPr>
-          <w:rFonts w:hint="eastAsia"/>
-        </w:rPr>
       </w:pPr>
       <w:r>
         <w:rPr>
@@ -113,107 +141,39 @@
     </w:p>
     <w:p>
       <w:pPr>
-        <w:spacing w:after="60" w:before="0" w:line="240" w:lineRule="auto"/>
+        <w:spacing w:after="60" w:line="240" w:lineRule="auto"/>
         <w:ind w:left="280" w:hanging="160"/>
-        <w:rPr>
-          <w:rFonts w:hint="eastAsia"/>
-        </w:rPr>
       </w:pPr>
       <w:r>
         <w:rPr>
           <w:rFonts w:eastAsia="Georgia"/>
           <w:sz w:val="20"/>
         </w:rPr>
-        <w:t>- napraviti testove koji pokazuju da nove instrukcije rade i da osnovne nisu pokvarene</w:t>
+        <w:t xml:space="preserve">- napraviti testove koji pokazuju da nove instrukcije rade </w:t>
       </w:r>
     </w:p>
     <w:p>
       <w:pPr>
-        <w:spacing w:after="60" w:line="240" w:lineRule="auto" w:before="0"/>
-        <w:rPr>
-          <w:rFonts w:hint="eastAsia"/>
-        </w:rPr>
+        <w:spacing w:after="60" w:line="240" w:lineRule="auto"/>
       </w:pPr>
       <w:r>
         <w:rPr>
           <w:rFonts w:eastAsia="Georgia"/>
         </w:rPr>
-        <w:t xml:space="preserve">Projekat je uradjen </w:t>
-      </w:r>
-      <w:proofErr w:type="spellStart"/>
-      <w:r>
-        <w:rPr>
-          <w:rFonts w:eastAsia="Georgia"/>
-        </w:rPr>
-        <w:t>kao</w:t>
-      </w:r>
-      <w:proofErr w:type="spellEnd"/>
-      <w:r>
-        <w:rPr>
-          <w:rFonts w:eastAsia="Georgia"/>
-        </w:rPr>
-        <w:t xml:space="preserve"> </w:t>
-      </w:r>
-      <w:proofErr w:type="spellStart"/>
-      <w:r>
-        <w:rPr>
-          <w:rFonts w:eastAsia="Georgia"/>
-        </w:rPr>
-        <w:t>nadogradnja</w:t>
-      </w:r>
-      <w:proofErr w:type="spellEnd"/>
-      <w:r>
-        <w:rPr>
-          <w:rFonts w:eastAsia="Georgia"/>
-        </w:rPr>
-        <w:t xml:space="preserve"> </w:t>
-      </w:r>
-      <w:proofErr w:type="spellStart"/>
-      <w:r>
-        <w:rPr>
-          <w:rFonts w:eastAsia="Georgia"/>
-        </w:rPr>
-        <w:t>postojeceg</w:t>
-      </w:r>
-      <w:proofErr w:type="spellEnd"/>
-      <w:r>
-        <w:rPr>
-          <w:rFonts w:eastAsia="Georgia"/>
-        </w:rPr>
-        <w:t xml:space="preserve"> </w:t>
-      </w:r>
-      <w:r>
-        <w:rPr>
-          <w:rFonts w:eastAsia="Georgia"/>
-        </w:rPr>
-        <w:t xml:space="preserve">RISC-V </w:t>
-      </w:r>
-      <w:proofErr w:type="spellStart"/>
-      <w:r>
-        <w:rPr>
-          <w:rFonts w:eastAsia="Georgia"/>
-        </w:rPr>
-        <w:t>procesora</w:t>
-      </w:r>
-      <w:proofErr w:type="spellEnd"/>
-      <w:r>
-        <w:rPr>
-          <w:rFonts w:eastAsia="Georgia"/>
-        </w:rPr>
-        <w:t xml:space="preserve">. </w:t>
+        <w:t xml:space="preserve">Projekat je uradjen kao nadogradnja postojeceg RISC-V procesora. </w:t>
       </w:r>
     </w:p>
     <w:tbl>
       <w:tblPr>
         <w:tblW w:w="0" w:type="auto"/>
         <w:jc w:val="center"/>
-        <w:tblLook w:val="04A0" w:firstRow="1" w:lastRow="0" w:firstColumn="1" w:lastColumn="0" w:noHBand="0" w:noVBand="1"/>
         <w:tblCellMar>
           <w:top w:w="60" w:type="dxa"/>
-          <w:start w:w="80" w:type="dxa"/>
+          <w:left w:w="80" w:type="dxa"/>
           <w:bottom w:w="60" w:type="dxa"/>
-          <w:end w:w="80" w:type="dxa"/>
+          <w:right w:w="80" w:type="dxa"/>
         </w:tblCellMar>
+        <w:tblLook w:val="04A0" w:firstRow="1" w:lastRow="0" w:firstColumn="1" w:lastColumn="0" w:noHBand="0" w:noVBand="1"/>
       </w:tblPr>
       <w:tblGrid>
         <w:gridCol w:w="1536"/>
@@ -246,29 +206,16 @@
           </w:tcPr>
           <w:p>
             <w:pPr>
-              <w:spacing w:before="0" w:after="0" w:line="240" w:lineRule="auto"/>
+              <w:spacing w:after="0" w:line="240" w:lineRule="auto"/>
               <w:jc w:val="center"/>
-              <w:rPr>
-                <w:rFonts w:hint="eastAsia"/>
-              </w:rPr>
             </w:pPr>
-            <w:proofErr w:type="spellStart"/>
             <w:r>
               <w:rPr>
                 <w:rFonts w:eastAsia="Georgia"/>
                 <w:b/>
                 <w:sz w:val="18"/>
               </w:rPr>
-              <w:t>instr</w:t>
-            </w:r>
-            <w:proofErr w:type="spellEnd"/>
-            <w:r>
-              <w:rPr>
-                <w:rFonts w:eastAsia="Georgia"/>
-                <w:b/>
-                <w:sz w:val="18"/>
-              </w:rPr>
-              <w:t xml:space="preserve"> mem</w:t>
+              <w:t>instr mem</w:t>
             </w:r>
           </w:p>
         </w:tc>
@@ -292,11 +239,8 @@
           </w:tcPr>
           <w:p>
             <w:pPr>
-              <w:spacing w:before="0" w:after="0" w:line="240" w:lineRule="auto"/>
+              <w:spacing w:after="0" w:line="240" w:lineRule="auto"/>
               <w:jc w:val="center"/>
-              <w:rPr>
-                <w:rFonts w:hint="eastAsia"/>
-              </w:rPr>
             </w:pPr>
             <w:r>
               <w:rPr>
@@ -328,11 +272,8 @@
           </w:tcPr>
           <w:p>
             <w:pPr>
-              <w:spacing w:before="0" w:after="0" w:line="240" w:lineRule="auto"/>
+              <w:spacing w:after="0" w:line="240" w:lineRule="auto"/>
               <w:jc w:val="center"/>
-              <w:rPr>
-                <w:rFonts w:hint="eastAsia"/>
-              </w:rPr>
             </w:pPr>
             <w:r>
               <w:rPr>
@@ -364,11 +305,8 @@
           </w:tcPr>
           <w:p>
             <w:pPr>
-              <w:spacing w:before="0" w:after="0" w:line="240" w:lineRule="auto"/>
+              <w:spacing w:after="0" w:line="240" w:lineRule="auto"/>
               <w:jc w:val="center"/>
-              <w:rPr>
-                <w:rFonts w:hint="eastAsia"/>
-              </w:rPr>
             </w:pPr>
             <w:r>
               <w:rPr>
@@ -400,11 +338,8 @@
           </w:tcPr>
           <w:p>
             <w:pPr>
-              <w:spacing w:before="0" w:after="0" w:line="240" w:lineRule="auto"/>
+              <w:spacing w:after="0" w:line="240" w:lineRule="auto"/>
               <w:jc w:val="center"/>
-              <w:rPr>
-                <w:rFonts w:hint="eastAsia"/>
-              </w:rPr>
             </w:pPr>
             <w:r>
               <w:rPr>
@@ -440,11 +375,8 @@
           </w:tcPr>
           <w:p>
             <w:pPr>
-              <w:spacing w:before="0" w:after="0" w:line="240" w:lineRule="auto"/>
+              <w:spacing w:after="0" w:line="240" w:lineRule="auto"/>
               <w:jc w:val="center"/>
-              <w:rPr>
-                <w:rFonts w:hint="eastAsia"/>
-              </w:rPr>
             </w:pPr>
             <w:r>
               <w:rPr>
@@ -474,11 +406,8 @@
           </w:tcPr>
           <w:p>
             <w:pPr>
-              <w:spacing w:before="0" w:after="0" w:line="240" w:lineRule="auto"/>
+              <w:spacing w:after="0" w:line="240" w:lineRule="auto"/>
               <w:jc w:val="center"/>
-              <w:rPr>
-                <w:rFonts w:hint="eastAsia"/>
-              </w:rPr>
             </w:pPr>
             <w:r>
               <w:rPr>
@@ -508,11 +437,8 @@
           </w:tcPr>
           <w:p>
             <w:pPr>
-              <w:spacing w:before="0" w:after="0" w:line="240" w:lineRule="auto"/>
+              <w:spacing w:after="0" w:line="240" w:lineRule="auto"/>
               <w:jc w:val="center"/>
-              <w:rPr>
-                <w:rFonts w:hint="eastAsia"/>
-              </w:rPr>
             </w:pPr>
             <w:r>
               <w:rPr>
@@ -542,11 +468,8 @@
           </w:tcPr>
           <w:p>
             <w:pPr>
-              <w:spacing w:before="0" w:after="0" w:line="240" w:lineRule="auto"/>
+              <w:spacing w:after="0" w:line="240" w:lineRule="auto"/>
               <w:jc w:val="center"/>
-              <w:rPr>
-                <w:rFonts w:hint="eastAsia"/>
-              </w:rPr>
             </w:pPr>
             <w:r>
               <w:rPr>
@@ -576,11 +499,8 @@
           </w:tcPr>
           <w:p>
             <w:pPr>
-              <w:spacing w:before="0" w:after="0" w:line="240" w:lineRule="auto"/>
+              <w:spacing w:after="0" w:line="240" w:lineRule="auto"/>
               <w:jc w:val="center"/>
-              <w:rPr>
-                <w:rFonts w:hint="eastAsia"/>
-              </w:rPr>
             </w:pPr>
           </w:p>
         </w:tc>
@@ -588,11 +508,8 @@
     </w:tbl>
     <w:p>
       <w:pPr>
-        <w:spacing w:after="60" w:before="0" w:line="240" w:lineRule="auto"/>
+        <w:spacing w:after="60" w:line="240" w:lineRule="auto"/>
         <w:jc w:val="center"/>
-        <w:rPr>
-          <w:rFonts w:hint="eastAsia"/>
-        </w:rPr>
       </w:pPr>
       <w:r>
         <w:rPr>
@@ -600,44 +517,13 @@
           <w:i/>
           <w:sz w:val="20"/>
         </w:rPr>
-        <w:t xml:space="preserve">Slika 1. </w:t>
+        <w:t>Slika 1. organizacija procesora</w:t>
       </w:r>
-      <w:proofErr w:type="spellStart"/>
-      <w:r>
-        <w:rPr>
-          <w:rFonts w:eastAsia="Georgia"/>
-          <w:i/>
-          <w:sz w:val="20"/>
-        </w:rPr>
-        <w:t>organizacija</w:t>
-      </w:r>
-      <w:proofErr w:type="spellEnd"/>
-      <w:r>
-        <w:rPr>
-          <w:rFonts w:eastAsia="Georgia"/>
-          <w:i/>
-          <w:sz w:val="20"/>
-        </w:rPr>
-        <w:t xml:space="preserve"> </w:t>
-      </w:r>
-      <w:proofErr w:type="spellStart"/>
-      <w:r>
-        <w:rPr>
-          <w:rFonts w:eastAsia="Georgia"/>
-          <w:i/>
-          <w:sz w:val="20"/>
-        </w:rPr>
-        <w:t>procesora</w:t>
-      </w:r>
-      <w:proofErr w:type="spellEnd"/>
     </w:p>
     <w:p>
       <w:pPr>
         <w:keepNext/>
-        <w:spacing w:before="0" w:after="60" w:line="240" w:lineRule="auto"/>
-        <w:rPr>
-          <w:rFonts w:hint="eastAsia"/>
-        </w:rPr>
+        <w:spacing w:after="60" w:line="240" w:lineRule="auto"/>
       </w:pPr>
       <w:r>
         <w:rPr>
@@ -651,10 +537,7 @@
     </w:p>
     <w:p>
       <w:pPr>
-        <w:spacing w:after="60" w:line="240" w:lineRule="auto" w:before="0"/>
-        <w:rPr>
-          <w:rFonts w:hint="eastAsia"/>
-        </w:rPr>
+        <w:spacing w:after="60" w:line="240" w:lineRule="auto"/>
       </w:pPr>
       <w:r>
         <w:rPr>
@@ -662,97 +545,47 @@
         </w:rPr>
         <w:t xml:space="preserve">Kao osnova je uzet materijal sa </w:t>
       </w:r>
-      <w:proofErr w:type="spellStart"/>
       <w:r>
         <w:rPr>
           <w:rFonts w:eastAsia="Georgia"/>
         </w:rPr>
         <w:t>sajta</w:t>
       </w:r>
-      <w:proofErr w:type="spellEnd"/>
-      <w:r>
-        <w:rPr>
-          <w:rFonts w:eastAsia="Georgia"/>
-        </w:rPr>
-        <w:t xml:space="preserve"> Napredni </w:t>
-      </w:r>
-      <w:proofErr w:type="spellStart"/>
-      <w:r>
-        <w:rPr>
-          <w:rFonts w:eastAsia="Georgia"/>
-        </w:rPr>
-        <w:t>mikroprocesorski</w:t>
-      </w:r>
-      <w:proofErr w:type="spellEnd"/>
       <w:r>
         <w:rPr>
           <w:rFonts w:eastAsia="Georgia"/>
         </w:rPr>
         <w:t xml:space="preserve"> </w:t>
       </w:r>
-      <w:proofErr w:type="spellStart"/>
       <w:r>
         <w:rPr>
           <w:rFonts w:eastAsia="Georgia"/>
         </w:rPr>
-        <w:t>sistemi</w:t>
+        <w:t xml:space="preserve">predmeta. </w:t>
       </w:r>
-      <w:proofErr w:type="spellEnd"/>
       <w:r>
         <w:rPr>
           <w:rFonts w:eastAsia="Georgia"/>
         </w:rPr>
-        <w:t xml:space="preserve">, </w:t>
+        <w:br/>
+        <w:t>O</w:t>
       </w:r>
-      <w:proofErr w:type="spellStart"/>
       <w:r>
         <w:rPr>
           <w:rFonts w:eastAsia="Georgia"/>
         </w:rPr>
-        <w:t>vjezba</w:t>
-      </w:r>
-      <w:proofErr w:type="spellEnd"/>
-      <w:r>
-        <w:rPr>
-          <w:rFonts w:eastAsia="Georgia"/>
-        </w:rPr>
-        <w:t xml:space="preserve"> 2 </w:t>
-      </w:r>
-      <w:proofErr w:type="spellStart"/>
-      <w:r>
-        <w:rPr>
-          <w:rFonts w:eastAsia="Georgia"/>
-        </w:rPr>
-        <w:t>koja</w:t>
-      </w:r>
-      <w:proofErr w:type="spellEnd"/>
-      <w:r>
-        <w:rPr>
-          <w:rFonts w:eastAsia="Georgia"/>
-        </w:rPr>
-        <w:t xml:space="preserve"> </w:t>
-      </w:r>
-      <w:proofErr w:type="spellStart"/>
-      <w:r>
-        <w:rPr>
-          <w:rFonts w:eastAsia="Georgia"/>
-        </w:rPr>
-        <w:t>obradjuje</w:t>
-      </w:r>
-      <w:proofErr w:type="spellEnd"/>
-      <w:r>
-        <w:rPr>
-          <w:rFonts w:eastAsia="Georgia"/>
-        </w:rPr>
-        <w:t xml:space="preserve"> hardversku implementaciju single-cycle RISC-V procesora. Iz tog materijala je preuzeta osnovna ideja procesora: jedan takt za izvrsavanje instrukcije, razdvajanje na controlpath i datapath, registarska banka, ALU, immediate blok i odvojeni memorijski interfejs za instrukcije i podatke. </w:t>
+        <w:t xml:space="preserve">snovna ideja procesora: jedan takt za izvrsavanje instrukcije, razdvajanje na controlpath i datapath, registarska banka, ALU, immediate blok i odvojeni memorijski interfejs za instrukcije i podatke. </w:t>
       </w:r>
     </w:p>
     <w:p>
       <w:pPr>
-        <w:spacing w:before="0" w:after="60" w:line="240" w:lineRule="auto"/>
+        <w:spacing w:after="60" w:line="240" w:lineRule="auto"/>
       </w:pPr>
       <w:r>
-        <w:t>Radi lakseg povezivanja sa polaznim materijalom, ispod je prikazan osnovni RISC-V datapath koji je posluzio kao referenca za organizaciju putanje podataka i memorijskih interfejsa.</w:t>
+        <w:t>Prikazan je</w:t>
+      </w:r>
+      <w:r>
+        <w:t xml:space="preserve"> osnovni RISC-V datapath koji je posluzio kao referenca za organizaciju putanje podataka i memorijskih interfejsa.</w:t>
       </w:r>
     </w:p>
     <w:p>
@@ -760,22 +593,26 @@
         <w:jc w:val="center"/>
       </w:pPr>
       <w:r>
+        <w:rPr>
+          <w:noProof/>
+        </w:rPr>
         <w:drawing>
-          <wp:inline xmlns:a="http://schemas.openxmlformats.org/drawingml/2006/main" xmlns:pic="http://schemas.openxmlformats.org/drawingml/2006/picture">
+          <wp:inline distT="0" distB="0" distL="0" distR="0" wp14:anchorId="36370292" wp14:editId="776A73E7">
             <wp:extent cx="5303520" cy="2869117"/>
+            <wp:effectExtent l="0" t="0" r="0" b="0"/>
             <wp:docPr id="1" name="Picture 1"/>
             <wp:cNvGraphicFramePr>
-              <a:graphicFrameLocks noChangeAspect="1"/>
+              <a:graphicFrameLocks xmlns:a="http://schemas.openxmlformats.org/drawingml/2006/main" noChangeAspect="1"/>
             </wp:cNvGraphicFramePr>
-            <a:graphic>
+            <a:graphic xmlns:a="http://schemas.openxmlformats.org/drawingml/2006/main">
               <a:graphicData uri="http://schemas.openxmlformats.org/drawingml/2006/picture">
-                <pic:pic>
+                <pic:pic xmlns:pic="http://schemas.openxmlformats.org/drawingml/2006/picture">
                   <pic:nvPicPr>
                     <pic:cNvPr id="0" name="crop_datapath_nocaption.png"/>
                     <pic:cNvPicPr/>
                   </pic:nvPicPr>
                   <pic:blipFill>
-                    <a:blip r:embed="rId12"/>
+                    <a:blip r:embed="rId8"/>
                     <a:stretch>
                       <a:fillRect/>
                     </a:stretch>
@@ -785,7 +622,9 @@
                       <a:off x="0" y="0"/>
                       <a:ext cx="5303520" cy="2869117"/>
                     </a:xfrm>
-                    <a:prstGeom prst="rect"/>
+                    <a:prstGeom prst="rect">
+                      <a:avLst/>
+                    </a:prstGeom>
                   </pic:spPr>
                 </pic:pic>
               </a:graphicData>
@@ -796,7 +635,7 @@
     </w:p>
     <w:p>
       <w:pPr>
-        <w:spacing w:before="0" w:after="60" w:line="240" w:lineRule="auto"/>
+        <w:spacing w:after="60" w:line="240" w:lineRule="auto"/>
         <w:jc w:val="center"/>
       </w:pPr>
       <w:r>
@@ -804,15 +643,12 @@
           <w:i/>
           <w:sz w:val="20"/>
         </w:rPr>
-        <w:t>Slika 2. osnovni RISC-V datapath iz polaznog PDF materijala</w:t>
+        <w:t xml:space="preserve">Slika 2. osnovni RISC-V datapath </w:t>
       </w:r>
     </w:p>
     <w:p>
       <w:pPr>
-        <w:spacing w:after="60" w:line="240" w:lineRule="auto" w:before="0"/>
-        <w:rPr>
-          <w:rFonts w:hint="eastAsia"/>
-        </w:rPr>
+        <w:spacing w:after="60" w:line="240" w:lineRule="auto"/>
       </w:pPr>
       <w:r>
         <w:rPr>
@@ -823,11 +659,7 @@
     </w:p>
     <w:p>
       <w:pPr>
-        <w:spacing w:after="0" w:before="0" w:line="240" w:lineRule="auto"/>
-        <w:ind w:left="280" w:hanging="160"/>
-        <w:rPr>
-          <w:rFonts w:hint="eastAsia"/>
-        </w:rPr>
+        <w:spacing w:after="0" w:line="240" w:lineRule="auto"/>
       </w:pPr>
       <w:r>
         <w:rPr>
@@ -839,10 +671,7 @@
     </w:p>
     <w:p>
       <w:pPr>
-        <w:spacing w:after="60" w:line="240" w:lineRule="auto" w:before="0"/>
-        <w:rPr>
-          <w:rFonts w:hint="eastAsia"/>
-        </w:rPr>
+        <w:spacing w:after="60" w:line="240" w:lineRule="auto"/>
       </w:pPr>
       <w:r>
         <w:rPr>
@@ -860,14 +689,7 @@
         <w:rPr>
           <w:rFonts w:eastAsia="Georgia"/>
         </w:rPr>
-        <w:t xml:space="preserve"> </w:t>
-      </w:r>
-      <w:proofErr w:type="spellStart"/>
-      <w:r>
-        <w:rPr>
-          <w:rFonts w:eastAsia="Georgia"/>
-        </w:rPr>
-        <w:t>zadrzan</w:t>
+        <w:t xml:space="preserve"> zadrzan</w:t>
       </w:r>
       <w:r>
         <w:rPr>
@@ -875,14 +697,24 @@
         </w:rPr>
         <w:t>o</w:t>
       </w:r>
-      <w:proofErr w:type="spellEnd"/>
       <w:r>
         <w:rPr>
           <w:rFonts w:eastAsia="Georgia"/>
         </w:rPr>
-        <w:t xml:space="preserve">, ali je prosirena tako da pokrije siri RV32I skup, RV32M ekstenziju i dio Zbb instrukcija. </w:t>
+        <w:t>, ali je prosiren</w:t>
       </w:r>
-      <w:proofErr w:type="spellStart"/>
+      <w:r>
+        <w:rPr>
+          <w:rFonts w:eastAsia="Georgia"/>
+        </w:rPr>
+        <w:t>o</w:t>
+      </w:r>
+      <w:r>
+        <w:rPr>
+          <w:rFonts w:eastAsia="Georgia"/>
+        </w:rPr>
+        <w:t xml:space="preserve"> tako da pokrije siri RV32I skup, RV32M ekstenziju i dio Zbb instrukcija. </w:t>
+      </w:r>
       <w:r>
         <w:rPr>
           <w:rFonts w:eastAsia="Georgia"/>
@@ -893,72 +725,26 @@
         <w:rPr>
           <w:rFonts w:eastAsia="Georgia"/>
         </w:rPr>
-        <w:t>odati</w:t>
-      </w:r>
-      <w:proofErr w:type="spellEnd"/>
-      <w:r>
-        <w:rPr>
-          <w:rFonts w:eastAsia="Georgia"/>
-        </w:rPr>
-        <w:t xml:space="preserve"> </w:t>
-      </w:r>
-      <w:proofErr w:type="spellStart"/>
-      <w:r>
-        <w:rPr>
-          <w:rFonts w:eastAsia="Georgia"/>
-        </w:rPr>
-        <w:t>su</w:t>
-      </w:r>
-      <w:proofErr w:type="spellEnd"/>
-      <w:r>
-        <w:rPr>
-          <w:rFonts w:eastAsia="Georgia"/>
-        </w:rPr>
-        <w:t xml:space="preserve"> </w:t>
+        <w:t xml:space="preserve">odati </w:t>
       </w:r>
       <w:r>
         <w:rPr>
           <w:rFonts w:eastAsia="Georgia"/>
         </w:rPr>
-        <w:t xml:space="preserve">novi </w:t>
+        <w:t xml:space="preserve">su </w:t>
       </w:r>
-      <w:proofErr w:type="spellStart"/>
       <w:r>
         <w:rPr>
           <w:rFonts w:eastAsia="Georgia"/>
         </w:rPr>
-        <w:t>dekoderi</w:t>
-      </w:r>
-      <w:proofErr w:type="spellEnd"/>
-      <w:r>
-        <w:rPr>
-          <w:rFonts w:eastAsia="Georgia"/>
-        </w:rPr>
-        <w:t xml:space="preserve">, novi ALU </w:t>
-      </w:r>
-      <w:proofErr w:type="spellStart"/>
-      <w:r>
-        <w:rPr>
-          <w:rFonts w:eastAsia="Georgia"/>
-        </w:rPr>
-        <w:t>kodovi</w:t>
-      </w:r>
-      <w:proofErr w:type="spellEnd"/>
-      <w:r>
-        <w:rPr>
-          <w:rFonts w:eastAsia="Georgia"/>
-        </w:rPr>
-        <w:t>, novi immediate formati, dodatni izbori za PC i dodatni test scenariji</w:t>
+        <w:t>novi dekoderi, novi ALU kodovi, novi immediate formati, dodatni izbori za PC i dodatni test scenariji</w:t>
       </w:r>
     </w:p>
     <w:p>
       <w:pPr>
         <w:keepNext/>
         <w:pageBreakBefore/>
-        <w:spacing w:before="0" w:after="60" w:line="240" w:lineRule="auto"/>
-        <w:rPr>
-          <w:rFonts w:hint="eastAsia"/>
-        </w:rPr>
+        <w:spacing w:after="60" w:line="240" w:lineRule="auto"/>
       </w:pPr>
       <w:r>
         <w:rPr>
@@ -967,6 +753,7 @@
           <w:color w:val="5B447A"/>
           <w:sz w:val="29"/>
         </w:rPr>
+        <w:lastRenderedPageBreak/>
         <w:t>3. struktura projekta</w:t>
       </w:r>
     </w:p>
@@ -974,17 +761,17 @@
       <w:tblPr>
         <w:tblW w:w="0" w:type="auto"/>
         <w:jc w:val="center"/>
-        <w:tblLook w:val="04A0" w:firstRow="1" w:lastRow="0" w:firstColumn="1" w:lastColumn="0" w:noHBand="0" w:noVBand="1"/>
         <w:tblCellMar>
           <w:top w:w="60" w:type="dxa"/>
-          <w:start w:w="80" w:type="dxa"/>
+          <w:left w:w="80" w:type="dxa"/>
           <w:bottom w:w="60" w:type="dxa"/>
-          <w:end w:w="80" w:type="dxa"/>
+          <w:right w:w="80" w:type="dxa"/>
         </w:tblCellMar>
+        <w:tblLook w:val="04A0" w:firstRow="1" w:lastRow="0" w:firstColumn="1" w:lastColumn="0" w:noHBand="0" w:noVBand="1"/>
       </w:tblPr>
       <w:tblGrid>
-        <w:gridCol w:w="3406"/>
-        <w:gridCol w:w="6768"/>
+        <w:gridCol w:w="3240"/>
+        <w:gridCol w:w="6912"/>
       </w:tblGrid>
       <w:tr>
         <w:trPr>
@@ -1010,11 +797,8 @@
           </w:tcPr>
           <w:p>
             <w:pPr>
-              <w:spacing w:before="0" w:after="0" w:line="240" w:lineRule="auto"/>
+              <w:spacing w:after="0" w:line="240" w:lineRule="auto"/>
               <w:jc w:val="center"/>
-              <w:rPr>
-                <w:rFonts w:hint="eastAsia"/>
-              </w:rPr>
             </w:pPr>
             <w:r>
               <w:rPr>
@@ -1046,11 +830,8 @@
           </w:tcPr>
           <w:p>
             <w:pPr>
-              <w:spacing w:before="0" w:after="0" w:line="240" w:lineRule="auto"/>
+              <w:spacing w:after="0" w:line="240" w:lineRule="auto"/>
               <w:jc w:val="center"/>
-              <w:rPr>
-                <w:rFonts w:hint="eastAsia"/>
-              </w:rPr>
             </w:pPr>
             <w:r>
               <w:rPr>
@@ -1086,10 +867,7 @@
           </w:tcPr>
           <w:p>
             <w:pPr>
-              <w:spacing w:before="0" w:after="0" w:line="240" w:lineRule="auto"/>
-              <w:rPr>
-                <w:rFonts w:hint="eastAsia"/>
-              </w:rPr>
+              <w:spacing w:after="0" w:line="240" w:lineRule="auto"/>
             </w:pPr>
             <w:r>
               <w:rPr>
@@ -1120,10 +898,7 @@
           </w:tcPr>
           <w:p>
             <w:pPr>
-              <w:spacing w:before="0" w:after="0" w:line="240" w:lineRule="auto"/>
-              <w:rPr>
-                <w:rFonts w:hint="eastAsia"/>
-              </w:rPr>
+              <w:spacing w:after="0" w:line="240" w:lineRule="auto"/>
             </w:pPr>
             <w:r>
               <w:rPr>
@@ -1158,10 +933,7 @@
           </w:tcPr>
           <w:p>
             <w:pPr>
-              <w:spacing w:before="0" w:after="0" w:line="240" w:lineRule="auto"/>
-              <w:rPr>
-                <w:rFonts w:hint="eastAsia"/>
-              </w:rPr>
+              <w:spacing w:after="0" w:line="240" w:lineRule="auto"/>
             </w:pPr>
             <w:r>
               <w:rPr>
@@ -1192,10 +964,7 @@
           </w:tcPr>
           <w:p>
             <w:pPr>
-              <w:spacing w:before="0" w:after="0" w:line="240" w:lineRule="auto"/>
-              <w:rPr>
-                <w:rFonts w:hint="eastAsia"/>
-              </w:rPr>
+              <w:spacing w:after="0" w:line="240" w:lineRule="auto"/>
             </w:pPr>
             <w:r>
               <w:rPr>
@@ -1230,10 +999,7 @@
           </w:tcPr>
           <w:p>
             <w:pPr>
-              <w:spacing w:before="0" w:after="0" w:line="240" w:lineRule="auto"/>
-              <w:rPr>
-                <w:rFonts w:hint="eastAsia"/>
-              </w:rPr>
+              <w:spacing w:after="0" w:line="240" w:lineRule="auto"/>
             </w:pPr>
             <w:r>
               <w:rPr>
@@ -1264,10 +1030,7 @@
           </w:tcPr>
           <w:p>
             <w:pPr>
-              <w:spacing w:before="0" w:after="0" w:line="240" w:lineRule="auto"/>
-              <w:rPr>
-                <w:rFonts w:hint="eastAsia"/>
-              </w:rPr>
+              <w:spacing w:after="0" w:line="240" w:lineRule="auto"/>
             </w:pPr>
             <w:r>
               <w:rPr>
@@ -1302,10 +1065,7 @@
           </w:tcPr>
           <w:p>
             <w:pPr>
-              <w:spacing w:before="0" w:after="0" w:line="240" w:lineRule="auto"/>
-              <w:rPr>
-                <w:rFonts w:hint="eastAsia"/>
-              </w:rPr>
+              <w:spacing w:after="0" w:line="240" w:lineRule="auto"/>
             </w:pPr>
             <w:r>
               <w:rPr>
@@ -1336,10 +1096,7 @@
           </w:tcPr>
           <w:p>
             <w:pPr>
-              <w:spacing w:before="0" w:after="0" w:line="240" w:lineRule="auto"/>
-              <w:rPr>
-                <w:rFonts w:hint="eastAsia"/>
-              </w:rPr>
+              <w:spacing w:after="0" w:line="240" w:lineRule="auto"/>
             </w:pPr>
             <w:r>
               <w:rPr>
@@ -1374,10 +1131,7 @@
           </w:tcPr>
           <w:p>
             <w:pPr>
-              <w:spacing w:before="0" w:after="0" w:line="240" w:lineRule="auto"/>
-              <w:rPr>
-                <w:rFonts w:hint="eastAsia"/>
-              </w:rPr>
+              <w:spacing w:after="0" w:line="240" w:lineRule="auto"/>
             </w:pPr>
             <w:r>
               <w:rPr>
@@ -1408,10 +1162,7 @@
           </w:tcPr>
           <w:p>
             <w:pPr>
-              <w:spacing w:before="0" w:after="0" w:line="240" w:lineRule="auto"/>
-              <w:rPr>
-                <w:rFonts w:hint="eastAsia"/>
-              </w:rPr>
+              <w:spacing w:after="0" w:line="240" w:lineRule="auto"/>
             </w:pPr>
             <w:r>
               <w:rPr>
@@ -1446,10 +1197,7 @@
           </w:tcPr>
           <w:p>
             <w:pPr>
-              <w:spacing w:before="0" w:after="0" w:line="240" w:lineRule="auto"/>
-              <w:rPr>
-                <w:rFonts w:hint="eastAsia"/>
-              </w:rPr>
+              <w:spacing w:after="0" w:line="240" w:lineRule="auto"/>
             </w:pPr>
             <w:r>
               <w:rPr>
@@ -1480,10 +1228,7 @@
           </w:tcPr>
           <w:p>
             <w:pPr>
-              <w:spacing w:before="0" w:after="0" w:line="240" w:lineRule="auto"/>
-              <w:rPr>
-                <w:rFonts w:hint="eastAsia"/>
-              </w:rPr>
+              <w:spacing w:after="0" w:line="240" w:lineRule="auto"/>
             </w:pPr>
             <w:r>
               <w:rPr>
@@ -1518,10 +1263,7 @@
           </w:tcPr>
           <w:p>
             <w:pPr>
-              <w:spacing w:before="0" w:after="0" w:line="240" w:lineRule="auto"/>
-              <w:rPr>
-                <w:rFonts w:hint="eastAsia"/>
-              </w:rPr>
+              <w:spacing w:after="0" w:line="240" w:lineRule="auto"/>
             </w:pPr>
             <w:r>
               <w:rPr>
@@ -1552,10 +1294,7 @@
           </w:tcPr>
           <w:p>
             <w:pPr>
-              <w:spacing w:before="0" w:after="0" w:line="240" w:lineRule="auto"/>
-              <w:rPr>
-                <w:rFonts w:hint="eastAsia"/>
-              </w:rPr>
+              <w:spacing w:after="0" w:line="240" w:lineRule="auto"/>
             </w:pPr>
             <w:r>
               <w:rPr>
@@ -1590,10 +1329,7 @@
           </w:tcPr>
           <w:p>
             <w:pPr>
-              <w:spacing w:before="0" w:after="0" w:line="240" w:lineRule="auto"/>
-              <w:rPr>
-                <w:rFonts w:hint="eastAsia"/>
-              </w:rPr>
+              <w:spacing w:after="0" w:line="240" w:lineRule="auto"/>
             </w:pPr>
             <w:r>
               <w:rPr>
@@ -1624,10 +1360,7 @@
           </w:tcPr>
           <w:p>
             <w:pPr>
-              <w:spacing w:before="0" w:after="0" w:line="240" w:lineRule="auto"/>
-              <w:rPr>
-                <w:rFonts w:hint="eastAsia"/>
-              </w:rPr>
+              <w:spacing w:after="0" w:line="240" w:lineRule="auto"/>
             </w:pPr>
             <w:r>
               <w:rPr>
@@ -1662,10 +1395,7 @@
           </w:tcPr>
           <w:p>
             <w:pPr>
-              <w:spacing w:before="0" w:after="0" w:line="240" w:lineRule="auto"/>
-              <w:rPr>
-                <w:rFonts w:hint="eastAsia"/>
-              </w:rPr>
+              <w:spacing w:after="0" w:line="240" w:lineRule="auto"/>
             </w:pPr>
             <w:r>
               <w:rPr>
@@ -1696,10 +1426,7 @@
           </w:tcPr>
           <w:p>
             <w:pPr>
-              <w:spacing w:before="0" w:after="0" w:line="240" w:lineRule="auto"/>
-              <w:rPr>
-                <w:rFonts w:hint="eastAsia"/>
-              </w:rPr>
+              <w:spacing w:after="0" w:line="240" w:lineRule="auto"/>
             </w:pPr>
             <w:r>
               <w:rPr>
@@ -1734,10 +1461,7 @@
           </w:tcPr>
           <w:p>
             <w:pPr>
-              <w:spacing w:before="0" w:after="0" w:line="240" w:lineRule="auto"/>
-              <w:rPr>
-                <w:rFonts w:hint="eastAsia"/>
-              </w:rPr>
+              <w:spacing w:after="0" w:line="240" w:lineRule="auto"/>
             </w:pPr>
             <w:r>
               <w:rPr>
@@ -1768,10 +1492,7 @@
           </w:tcPr>
           <w:p>
             <w:pPr>
-              <w:spacing w:before="0" w:after="0" w:line="240" w:lineRule="auto"/>
-              <w:rPr>
-                <w:rFonts w:hint="eastAsia"/>
-              </w:rPr>
+              <w:spacing w:after="0" w:line="240" w:lineRule="auto"/>
             </w:pPr>
             <w:r>
               <w:rPr>
@@ -1787,18 +1508,12 @@
     <w:p>
       <w:pPr>
         <w:spacing w:after="20"/>
-        <w:rPr>
-          <w:rFonts w:hint="eastAsia"/>
-        </w:rPr>
       </w:pPr>
     </w:p>
     <w:p>
       <w:pPr>
         <w:keepNext/>
-        <w:spacing w:before="0" w:after="60" w:line="240" w:lineRule="auto"/>
-        <w:rPr>
-          <w:rFonts w:hint="eastAsia"/>
-        </w:rPr>
+        <w:spacing w:after="60" w:line="240" w:lineRule="auto"/>
       </w:pPr>
       <w:r>
         <w:rPr>
@@ -1807,34 +1522,52 @@
           <w:color w:val="5B447A"/>
           <w:sz w:val="29"/>
         </w:rPr>
-        <w:t>4. sta je dodato u odnosu na vjezbu</w:t>
+        <w:t>4. sta je dodato</w:t>
+      </w:r>
+      <w:r>
+        <w:rPr>
+          <w:rFonts w:eastAsia="Georgia"/>
+          <w:b/>
+          <w:color w:val="5B447A"/>
+          <w:sz w:val="29"/>
+        </w:rPr>
+        <w:t xml:space="preserve"> kao prosirenje</w:t>
       </w:r>
     </w:p>
     <w:p>
       <w:pPr>
-        <w:spacing w:after="60" w:line="240" w:lineRule="auto" w:before="0"/>
-        <w:rPr>
-          <w:rFonts w:hint="eastAsia"/>
-        </w:rPr>
+        <w:spacing w:after="60" w:line="240" w:lineRule="auto"/>
       </w:pPr>
       <w:r>
         <w:rPr>
           <w:rFonts w:eastAsia="Georgia"/>
         </w:rPr>
-        <w:t>Najvece izmjene su u dekoderima, ALU jedinici i putanji podataka. Kontrolni dio je prosiren zato sto vise nije dovoljno razlikovati samo load, store, R-tip, I-tip i beq. Sada postoje i skokovi, dodatne branch instrukcije, sistemske instrukcije, U-tip instrukcije i vise izvora za upis u registar</w:t>
+        <w:t xml:space="preserve">Najvece izmjene su u dekoderima, ALU jedinici i </w:t>
+      </w:r>
+      <w:r>
+        <w:rPr>
+          <w:rFonts w:eastAsia="Georgia"/>
+        </w:rPr>
+        <w:t>data pathu</w:t>
+      </w:r>
+      <w:r>
+        <w:rPr>
+          <w:rFonts w:eastAsia="Georgia"/>
+        </w:rPr>
+        <w:t>. Kontrolni dio je prosiren zato sto vise nije dovoljno razlikovati samo load, store, R-tip, I-tip i beq. Sada postoje i skokovi, dodatne branch instrukcije, sistemske instrukcije, U-tip instrukcije i vise izvora za upis u registar</w:t>
       </w:r>
     </w:p>
     <w:tbl>
       <w:tblPr>
         <w:tblW w:w="0" w:type="auto"/>
         <w:jc w:val="center"/>
-        <w:tblLook w:val="04A0" w:firstRow="1" w:lastRow="0" w:firstColumn="1" w:lastColumn="0" w:noHBand="0" w:noVBand="1"/>
         <w:tblCellMar>
           <w:top w:w="60" w:type="dxa"/>
-          <w:start w:w="80" w:type="dxa"/>
+          <w:left w:w="80" w:type="dxa"/>
           <w:bottom w:w="60" w:type="dxa"/>
-          <w:end w:w="80" w:type="dxa"/>
+          <w:right w:w="80" w:type="dxa"/>
         </w:tblCellMar>
+        <w:tblLook w:val="04A0" w:firstRow="1" w:lastRow="0" w:firstColumn="1" w:lastColumn="0" w:noHBand="0" w:noVBand="1"/>
       </w:tblPr>
       <w:tblGrid>
         <w:gridCol w:w="2880"/>
@@ -1864,11 +1597,8 @@
           </w:tcPr>
           <w:p>
             <w:pPr>
-              <w:spacing w:before="0" w:after="0" w:line="240" w:lineRule="auto"/>
+              <w:spacing w:after="0" w:line="240" w:lineRule="auto"/>
               <w:jc w:val="center"/>
-              <w:rPr>
-                <w:rFonts w:hint="eastAsia"/>
-              </w:rPr>
             </w:pPr>
             <w:r>
               <w:rPr>
@@ -1900,11 +1630,8 @@
           </w:tcPr>
           <w:p>
             <w:pPr>
-              <w:spacing w:before="0" w:after="0" w:line="240" w:lineRule="auto"/>
+              <w:spacing w:after="0" w:line="240" w:lineRule="auto"/>
               <w:jc w:val="center"/>
-              <w:rPr>
-                <w:rFonts w:hint="eastAsia"/>
-              </w:rPr>
             </w:pPr>
             <w:r>
               <w:rPr>
@@ -1940,10 +1667,7 @@
           </w:tcPr>
           <w:p>
             <w:pPr>
-              <w:spacing w:before="0" w:after="0" w:line="240" w:lineRule="auto"/>
-              <w:rPr>
-                <w:rFonts w:hint="eastAsia"/>
-              </w:rPr>
+              <w:spacing w:after="0" w:line="240" w:lineRule="auto"/>
             </w:pPr>
             <w:r>
               <w:rPr>
@@ -1974,10 +1698,7 @@
           </w:tcPr>
           <w:p>
             <w:pPr>
-              <w:spacing w:before="0" w:after="0" w:line="240" w:lineRule="auto"/>
-              <w:rPr>
-                <w:rFonts w:hint="eastAsia"/>
-              </w:rPr>
+              <w:spacing w:after="0" w:line="240" w:lineRule="auto"/>
             </w:pPr>
             <w:r>
               <w:rPr>
@@ -2012,10 +1733,7 @@
           </w:tcPr>
           <w:p>
             <w:pPr>
-              <w:spacing w:before="0" w:after="0" w:line="240" w:lineRule="auto"/>
-              <w:rPr>
-                <w:rFonts w:hint="eastAsia"/>
-              </w:rPr>
+              <w:spacing w:after="0" w:line="240" w:lineRule="auto"/>
             </w:pPr>
             <w:r>
               <w:rPr>
@@ -2046,10 +1764,7 @@
           </w:tcPr>
           <w:p>
             <w:pPr>
-              <w:spacing w:before="0" w:after="0" w:line="240" w:lineRule="auto"/>
-              <w:rPr>
-                <w:rFonts w:hint="eastAsia"/>
-              </w:rPr>
+              <w:spacing w:after="0" w:line="240" w:lineRule="auto"/>
             </w:pPr>
             <w:r>
               <w:rPr>
@@ -2084,10 +1799,7 @@
           </w:tcPr>
           <w:p>
             <w:pPr>
-              <w:spacing w:before="0" w:after="0" w:line="240" w:lineRule="auto"/>
-              <w:rPr>
-                <w:rFonts w:hint="eastAsia"/>
-              </w:rPr>
+              <w:spacing w:after="0" w:line="240" w:lineRule="auto"/>
             </w:pPr>
             <w:r>
               <w:rPr>
@@ -2118,10 +1830,7 @@
           </w:tcPr>
           <w:p>
             <w:pPr>
-              <w:spacing w:before="0" w:after="0" w:line="240" w:lineRule="auto"/>
-              <w:rPr>
-                <w:rFonts w:hint="eastAsia"/>
-              </w:rPr>
+              <w:spacing w:after="0" w:line="240" w:lineRule="auto"/>
             </w:pPr>
             <w:r>
               <w:rPr>
@@ -2156,10 +1865,7 @@
           </w:tcPr>
           <w:p>
             <w:pPr>
-              <w:spacing w:before="0" w:after="0" w:line="240" w:lineRule="auto"/>
-              <w:rPr>
-                <w:rFonts w:hint="eastAsia"/>
-              </w:rPr>
+              <w:spacing w:after="0" w:line="240" w:lineRule="auto"/>
             </w:pPr>
             <w:r>
               <w:rPr>
@@ -2190,10 +1896,7 @@
           </w:tcPr>
           <w:p>
             <w:pPr>
-              <w:spacing w:before="0" w:after="0" w:line="240" w:lineRule="auto"/>
-              <w:rPr>
-                <w:rFonts w:hint="eastAsia"/>
-              </w:rPr>
+              <w:spacing w:after="0" w:line="240" w:lineRule="auto"/>
             </w:pPr>
             <w:r>
               <w:rPr>
@@ -2228,10 +1931,7 @@
           </w:tcPr>
           <w:p>
             <w:pPr>
-              <w:spacing w:before="0" w:after="0" w:line="240" w:lineRule="auto"/>
-              <w:rPr>
-                <w:rFonts w:hint="eastAsia"/>
-              </w:rPr>
+              <w:spacing w:after="0" w:line="240" w:lineRule="auto"/>
             </w:pPr>
             <w:r>
               <w:rPr>
@@ -2239,7 +1939,6 @@
                 <w:b/>
                 <w:sz w:val="18"/>
               </w:rPr>
-              <w:lastRenderedPageBreak/>
               <w:t>ALU_simple.vhd</w:t>
             </w:r>
           </w:p>
@@ -2263,10 +1962,7 @@
           </w:tcPr>
           <w:p>
             <w:pPr>
-              <w:spacing w:before="0" w:after="0" w:line="240" w:lineRule="auto"/>
-              <w:rPr>
-                <w:rFonts w:hint="eastAsia"/>
-              </w:rPr>
+              <w:spacing w:after="0" w:line="240" w:lineRule="auto"/>
             </w:pPr>
             <w:r>
               <w:rPr>
@@ -2301,10 +1997,7 @@
           </w:tcPr>
           <w:p>
             <w:pPr>
-              <w:spacing w:before="0" w:after="0" w:line="240" w:lineRule="auto"/>
-              <w:rPr>
-                <w:rFonts w:hint="eastAsia"/>
-              </w:rPr>
+              <w:spacing w:after="0" w:line="240" w:lineRule="auto"/>
             </w:pPr>
             <w:r>
               <w:rPr>
@@ -2335,10 +2028,7 @@
           </w:tcPr>
           <w:p>
             <w:pPr>
-              <w:spacing w:before="0" w:after="0" w:line="240" w:lineRule="auto"/>
-              <w:rPr>
-                <w:rFonts w:hint="eastAsia"/>
-              </w:rPr>
+              <w:spacing w:after="0" w:line="240" w:lineRule="auto"/>
             </w:pPr>
             <w:r>
               <w:rPr>
@@ -2354,18 +2044,12 @@
     <w:p>
       <w:pPr>
         <w:spacing w:after="20"/>
-        <w:rPr>
-          <w:rFonts w:hint="eastAsia"/>
-        </w:rPr>
       </w:pPr>
     </w:p>
     <w:p>
       <w:pPr>
         <w:keepNext/>
-        <w:spacing w:before="0" w:after="60" w:line="240" w:lineRule="auto"/>
-        <w:rPr>
-          <w:rFonts w:hint="eastAsia"/>
-        </w:rPr>
+        <w:spacing w:after="60" w:line="240" w:lineRule="auto"/>
       </w:pPr>
       <w:r>
         <w:rPr>
@@ -2379,10 +2063,7 @@
     </w:p>
     <w:p>
       <w:pPr>
-        <w:spacing w:after="60" w:line="240" w:lineRule="auto" w:before="0"/>
-        <w:rPr>
-          <w:rFonts w:hint="eastAsia"/>
-        </w:rPr>
+        <w:spacing w:after="60" w:line="240" w:lineRule="auto"/>
       </w:pPr>
       <w:r>
         <w:rPr>
@@ -2393,7 +2074,7 @@
     </w:p>
     <w:p>
       <w:pPr>
-        <w:spacing w:before="0" w:after="60" w:line="240" w:lineRule="auto"/>
+        <w:spacing w:after="60" w:line="240" w:lineRule="auto"/>
       </w:pPr>
       <w:r>
         <w:t>Za dekodovanje prosirenih instrukcija korisno je imati pregled osnovnih RISC-V formata i rasporeda njihovih polja, jer se upravo na tim poljima zasniva razlikovanje opcode, funct i immediate dijelova.</w:t>
@@ -2402,34 +2083,58 @@
     <w:p>
       <w:pPr>
         <w:jc w:val="center"/>
+        <w:rPr>
+          <w:noProof/>
+        </w:rPr>
+      </w:pPr>
+    </w:p>
+    <w:p>
+      <w:pPr>
+        <w:jc w:val="center"/>
       </w:pPr>
       <w:r>
+        <w:rPr>
+          <w:noProof/>
+        </w:rPr>
+        <w:lastRenderedPageBreak/>
         <w:drawing>
-          <wp:inline xmlns:a="http://schemas.openxmlformats.org/drawingml/2006/main" xmlns:pic="http://schemas.openxmlformats.org/drawingml/2006/picture">
-            <wp:extent cx="5303520" cy="3671668"/>
+          <wp:inline distT="0" distB="0" distL="0" distR="0" wp14:anchorId="49ED5A8E" wp14:editId="47768200">
+            <wp:extent cx="5303378" cy="3543980"/>
+            <wp:effectExtent l="0" t="0" r="0" b="0"/>
             <wp:docPr id="2" name="Picture 2"/>
             <wp:cNvGraphicFramePr>
-              <a:graphicFrameLocks noChangeAspect="1"/>
+              <a:graphicFrameLocks xmlns:a="http://schemas.openxmlformats.org/drawingml/2006/main" noChangeAspect="1"/>
             </wp:cNvGraphicFramePr>
-            <a:graphic>
+            <a:graphic xmlns:a="http://schemas.openxmlformats.org/drawingml/2006/main">
               <a:graphicData uri="http://schemas.openxmlformats.org/drawingml/2006/picture">
-                <pic:pic>
+                <pic:pic xmlns:pic="http://schemas.openxmlformats.org/drawingml/2006/picture">
                   <pic:nvPicPr>
                     <pic:cNvPr id="0" name="crop_instr_wide.png"/>
                     <pic:cNvPicPr/>
                   </pic:nvPicPr>
-                  <pic:blipFill>
-                    <a:blip r:embed="rId13"/>
+                  <pic:blipFill rotWithShape="1">
+                    <a:blip r:embed="rId9"/>
+                    <a:srcRect t="3475"/>
                     <a:stretch>
                       <a:fillRect/>
                     </a:stretch>
                   </pic:blipFill>
-                  <pic:spPr>
+                  <pic:spPr bwMode="auto">
                     <a:xfrm>
                       <a:off x="0" y="0"/>
-                      <a:ext cx="5303520" cy="3671668"/>
+                      <a:ext cx="5303520" cy="3544075"/>
                     </a:xfrm>
-                    <a:prstGeom prst="rect"/>
+                    <a:prstGeom prst="rect">
+                      <a:avLst/>
+                    </a:prstGeom>
+                    <a:ln>
+                      <a:noFill/>
+                    </a:ln>
+                    <a:extLst>
+                      <a:ext uri="{53640926-AAD7-44D8-BBD7-CCE9431645EC}">
+                        <a14:shadowObscured xmlns:a14="http://schemas.microsoft.com/office/drawing/2010/main"/>
+                      </a:ext>
+                    </a:extLst>
                   </pic:spPr>
                 </pic:pic>
               </a:graphicData>
@@ -2440,7 +2145,7 @@
     </w:p>
     <w:p>
       <w:pPr>
-        <w:spacing w:before="0" w:after="60" w:line="240" w:lineRule="auto"/>
+        <w:spacing w:after="60" w:line="240" w:lineRule="auto"/>
         <w:jc w:val="center"/>
       </w:pPr>
       <w:r>
@@ -2448,20 +2153,20 @@
           <w:i/>
           <w:sz w:val="20"/>
         </w:rPr>
-        <w:t>Slika 3. pregled formata i polja RISC-V instrukcija relevantnih za dekodovanje</w:t>
+        <w:t>Slika 3. pregled formata i polja RISC-V instrukcija za dekodovanje</w:t>
       </w:r>
     </w:p>
     <w:tbl>
       <w:tblPr>
         <w:tblW w:w="0" w:type="auto"/>
         <w:jc w:val="center"/>
-        <w:tblLook w:val="04A0" w:firstRow="1" w:lastRow="0" w:firstColumn="1" w:lastColumn="0" w:noHBand="0" w:noVBand="1"/>
         <w:tblCellMar>
           <w:top w:w="60" w:type="dxa"/>
-          <w:start w:w="80" w:type="dxa"/>
+          <w:left w:w="80" w:type="dxa"/>
           <w:bottom w:w="60" w:type="dxa"/>
-          <w:end w:w="80" w:type="dxa"/>
+          <w:right w:w="80" w:type="dxa"/>
         </w:tblCellMar>
+        <w:tblLook w:val="04A0" w:firstRow="1" w:lastRow="0" w:firstColumn="1" w:lastColumn="0" w:noHBand="0" w:noVBand="1"/>
       </w:tblPr>
       <w:tblGrid>
         <w:gridCol w:w="2232"/>
@@ -2493,9 +2198,6 @@
             <w:pPr>
               <w:spacing w:before="20" w:after="20" w:line="240" w:lineRule="auto"/>
               <w:jc w:val="center"/>
-              <w:rPr>
-                <w:rFonts w:hint="eastAsia"/>
-              </w:rPr>
             </w:pPr>
             <w:r>
               <w:rPr>
@@ -2529,9 +2231,6 @@
             <w:pPr>
               <w:spacing w:before="20" w:after="20" w:line="240" w:lineRule="auto"/>
               <w:jc w:val="center"/>
-              <w:rPr>
-                <w:rFonts w:hint="eastAsia"/>
-              </w:rPr>
             </w:pPr>
             <w:r>
               <w:rPr>
@@ -2568,27 +2267,14 @@
           <w:p>
             <w:pPr>
               <w:spacing w:before="20" w:after="20" w:line="240" w:lineRule="auto"/>
-              <w:rPr>
-                <w:rFonts w:hint="eastAsia"/>
-              </w:rPr>
             </w:pPr>
-            <w:proofErr w:type="spellStart"/>
             <w:r>
               <w:rPr>
                 <w:rFonts w:eastAsia="Georgia"/>
                 <w:b/>
                 <w:sz w:val="18"/>
               </w:rPr>
-              <w:t>dodatni</w:t>
-            </w:r>
-            <w:proofErr w:type="spellEnd"/>
-            <w:r>
-              <w:rPr>
-                <w:rFonts w:eastAsia="Georgia"/>
-                <w:b/>
-                <w:sz w:val="18"/>
-              </w:rPr>
-              <w:t xml:space="preserve"> RV32I</w:t>
+              <w:t>dodatni RV32I</w:t>
             </w:r>
           </w:p>
         </w:tc>
@@ -2612,9 +2298,6 @@
           <w:p>
             <w:pPr>
               <w:spacing w:before="20" w:after="20" w:line="240" w:lineRule="auto"/>
-              <w:rPr>
-                <w:rFonts w:hint="eastAsia"/>
-              </w:rPr>
             </w:pPr>
             <w:r>
               <w:rPr>
@@ -2650,9 +2333,6 @@
           <w:p>
             <w:pPr>
               <w:spacing w:before="20" w:after="20" w:line="240" w:lineRule="auto"/>
-              <w:rPr>
-                <w:rFonts w:hint="eastAsia"/>
-              </w:rPr>
             </w:pPr>
             <w:r>
               <w:rPr>
@@ -2684,9 +2364,6 @@
           <w:p>
             <w:pPr>
               <w:spacing w:before="20" w:after="20" w:line="240" w:lineRule="auto"/>
-              <w:rPr>
-                <w:rFonts w:hint="eastAsia"/>
-              </w:rPr>
             </w:pPr>
             <w:r>
               <w:rPr>
@@ -2722,38 +2399,15 @@
           <w:p>
             <w:pPr>
               <w:spacing w:before="20" w:after="20" w:line="240" w:lineRule="auto"/>
-              <w:rPr>
-                <w:rFonts w:hint="eastAsia"/>
-              </w:rPr>
             </w:pPr>
-            <w:proofErr w:type="spellStart"/>
             <w:r>
               <w:rPr>
                 <w:rFonts w:eastAsia="Georgia"/>
                 <w:b/>
                 <w:sz w:val="18"/>
               </w:rPr>
-              <w:t>Zbb</w:t>
+              <w:t>Zbb podskup</w:t>
             </w:r>
-            <w:proofErr w:type="spellEnd"/>
-            <w:r>
-              <w:rPr>
-                <w:rFonts w:eastAsia="Georgia"/>
-                <w:b/>
-                <w:sz w:val="18"/>
-              </w:rPr>
-              <w:t xml:space="preserve"> </w:t>
-            </w:r>
-            <w:proofErr w:type="spellStart"/>
-            <w:r>
-              <w:rPr>
-                <w:rFonts w:eastAsia="Georgia"/>
-                <w:b/>
-                <w:sz w:val="18"/>
-              </w:rPr>
-              <w:t>podskup</w:t>
-            </w:r>
-            <w:proofErr w:type="spellEnd"/>
           </w:p>
         </w:tc>
         <w:tc>
@@ -2776,9 +2430,6 @@
           <w:p>
             <w:pPr>
               <w:spacing w:before="20" w:after="20" w:line="240" w:lineRule="auto"/>
-              <w:rPr>
-                <w:rFonts w:hint="eastAsia"/>
-              </w:rPr>
             </w:pPr>
             <w:r>
               <w:rPr>
@@ -2794,17 +2445,11 @@
     <w:p>
       <w:pPr>
         <w:spacing w:after="20"/>
-        <w:rPr>
-          <w:rFonts w:hint="eastAsia"/>
-        </w:rPr>
       </w:pPr>
     </w:p>
     <w:p>
       <w:pPr>
-        <w:spacing w:after="60" w:line="240" w:lineRule="auto" w:before="0"/>
-        <w:rPr>
-          <w:rFonts w:hint="eastAsia"/>
-        </w:rPr>
+        <w:spacing w:after="60" w:line="240" w:lineRule="auto"/>
       </w:pPr>
       <w:r>
         <w:rPr>
@@ -2815,10 +2460,7 @@
     </w:p>
     <w:p>
       <w:pPr>
-        <w:spacing w:after="60" w:line="240" w:lineRule="auto" w:before="0"/>
-        <w:rPr>
-          <w:rFonts w:hint="eastAsia"/>
-        </w:rPr>
+        <w:spacing w:after="60" w:line="240" w:lineRule="auto"/>
       </w:pPr>
       <w:r>
         <w:rPr>
@@ -2830,10 +2472,7 @@
     <w:p>
       <w:pPr>
         <w:keepNext/>
-        <w:spacing w:before="0" w:after="60" w:line="240" w:lineRule="auto"/>
-        <w:rPr>
-          <w:rFonts w:hint="eastAsia"/>
-        </w:rPr>
+        <w:spacing w:after="60" w:line="240" w:lineRule="auto"/>
       </w:pPr>
       <w:r>
         <w:rPr>
@@ -2847,11 +2486,8 @@
     </w:p>
     <w:p>
       <w:pPr>
-        <w:spacing w:after="60" w:before="0" w:line="240" w:lineRule="auto"/>
+        <w:spacing w:after="60" w:line="240" w:lineRule="auto"/>
         <w:ind w:left="280" w:hanging="160"/>
-        <w:rPr>
-          <w:rFonts w:hint="eastAsia"/>
-        </w:rPr>
       </w:pPr>
       <w:r>
         <w:rPr>
@@ -2863,11 +2499,8 @@
     </w:p>
     <w:p>
       <w:pPr>
-        <w:spacing w:after="60" w:before="0" w:line="240" w:lineRule="auto"/>
+        <w:spacing w:after="60" w:line="240" w:lineRule="auto"/>
         <w:ind w:left="280" w:hanging="160"/>
-        <w:rPr>
-          <w:rFonts w:hint="eastAsia"/>
-        </w:rPr>
       </w:pPr>
       <w:r>
         <w:rPr>
@@ -2879,11 +2512,8 @@
     </w:p>
     <w:p>
       <w:pPr>
-        <w:spacing w:after="60" w:before="0" w:line="240" w:lineRule="auto"/>
+        <w:spacing w:after="60" w:line="240" w:lineRule="auto"/>
         <w:ind w:left="280" w:hanging="160"/>
-        <w:rPr>
-          <w:rFonts w:hint="eastAsia"/>
-        </w:rPr>
       </w:pPr>
       <w:r>
         <w:rPr>
@@ -2895,11 +2525,8 @@
     </w:p>
     <w:p>
       <w:pPr>
-        <w:spacing w:after="60" w:before="0" w:line="240" w:lineRule="auto"/>
+        <w:spacing w:after="60" w:line="240" w:lineRule="auto"/>
         <w:ind w:left="280" w:hanging="160"/>
-        <w:rPr>
-          <w:rFonts w:hint="eastAsia"/>
-        </w:rPr>
       </w:pPr>
       <w:r>
         <w:rPr>
@@ -2911,11 +2538,8 @@
     </w:p>
     <w:p>
       <w:pPr>
-        <w:spacing w:after="60" w:before="0" w:line="240" w:lineRule="auto"/>
+        <w:spacing w:after="60" w:line="240" w:lineRule="auto"/>
         <w:ind w:left="280" w:hanging="160"/>
-        <w:rPr>
-          <w:rFonts w:hint="eastAsia"/>
-        </w:rPr>
       </w:pPr>
       <w:r>
         <w:rPr>
@@ -2927,11 +2551,8 @@
     </w:p>
     <w:p>
       <w:pPr>
-        <w:spacing w:after="60" w:before="0" w:line="240" w:lineRule="auto"/>
+        <w:spacing w:after="60" w:line="240" w:lineRule="auto"/>
         <w:ind w:left="280" w:hanging="160"/>
-        <w:rPr>
-          <w:rFonts w:hint="eastAsia"/>
-        </w:rPr>
       </w:pPr>
       <w:r>
         <w:rPr>
@@ -2943,26 +2564,20 @@
     </w:p>
     <w:p>
       <w:pPr>
-        <w:spacing w:after="60" w:before="0" w:line="240" w:lineRule="auto"/>
+        <w:spacing w:after="60" w:line="240" w:lineRule="auto"/>
         <w:ind w:left="280" w:hanging="160"/>
-        <w:rPr>
-          <w:rFonts w:hint="eastAsia"/>
-        </w:rPr>
       </w:pPr>
       <w:r>
         <w:rPr>
           <w:rFonts w:eastAsia="Georgia"/>
           <w:sz w:val="20"/>
         </w:rPr>
-        <w:t>- rezultat se upisuje u registar, memoriju ili koristi za promjenu PC-a</w:t>
+        <w:t>- rezultat se upisuje u registar, memoriju ili koristi za promjenu PCa</w:t>
       </w:r>
     </w:p>
     <w:p>
       <w:pPr>
-        <w:spacing w:after="60" w:line="240" w:lineRule="auto" w:before="0"/>
-        <w:rPr>
-          <w:rFonts w:hint="eastAsia"/>
-        </w:rPr>
+        <w:spacing w:after="60" w:line="240" w:lineRule="auto"/>
       </w:pPr>
       <w:r>
         <w:rPr>
@@ -2974,10 +2589,7 @@
     <w:p>
       <w:pPr>
         <w:keepNext/>
-        <w:spacing w:before="0" w:after="60" w:line="240" w:lineRule="auto"/>
-        <w:rPr>
-          <w:rFonts w:hint="eastAsia"/>
-        </w:rPr>
+        <w:spacing w:after="60" w:line="240" w:lineRule="auto"/>
       </w:pPr>
       <w:r>
         <w:rPr>
@@ -2986,15 +2598,13 @@
           <w:color w:val="5B447A"/>
           <w:sz w:val="29"/>
         </w:rPr>
+        <w:lastRenderedPageBreak/>
         <w:t>7. testiranje</w:t>
       </w:r>
     </w:p>
     <w:p>
       <w:pPr>
-        <w:spacing w:after="60" w:line="240" w:lineRule="auto" w:before="0"/>
-        <w:rPr>
-          <w:rFonts w:hint="eastAsia"/>
-        </w:rPr>
+        <w:spacing w:after="60" w:line="240" w:lineRule="auto"/>
       </w:pPr>
       <w:r>
         <w:rPr>
@@ -3007,13 +2617,13 @@
       <w:tblPr>
         <w:tblW w:w="0" w:type="auto"/>
         <w:jc w:val="center"/>
-        <w:tblLook w:val="04A0" w:firstRow="1" w:lastRow="0" w:firstColumn="1" w:lastColumn="0" w:noHBand="0" w:noVBand="1"/>
         <w:tblCellMar>
           <w:top w:w="60" w:type="dxa"/>
-          <w:start w:w="80" w:type="dxa"/>
+          <w:left w:w="80" w:type="dxa"/>
           <w:bottom w:w="60" w:type="dxa"/>
-          <w:end w:w="80" w:type="dxa"/>
+          <w:right w:w="80" w:type="dxa"/>
         </w:tblCellMar>
+        <w:tblLook w:val="04A0" w:firstRow="1" w:lastRow="0" w:firstColumn="1" w:lastColumn="0" w:noHBand="0" w:noVBand="1"/>
       </w:tblPr>
       <w:tblGrid>
         <w:gridCol w:w="3024"/>
@@ -3043,11 +2653,8 @@
           </w:tcPr>
           <w:p>
             <w:pPr>
-              <w:spacing w:before="0" w:after="0" w:line="240" w:lineRule="auto"/>
+              <w:spacing w:after="0" w:line="240" w:lineRule="auto"/>
               <w:jc w:val="center"/>
-              <w:rPr>
-                <w:rFonts w:hint="eastAsia"/>
-              </w:rPr>
             </w:pPr>
             <w:r>
               <w:rPr>
@@ -3055,7 +2662,6 @@
                 <w:b/>
                 <w:sz w:val="18"/>
               </w:rPr>
-              <w:lastRenderedPageBreak/>
               <w:t>test program</w:t>
             </w:r>
           </w:p>
@@ -3080,11 +2686,8 @@
           </w:tcPr>
           <w:p>
             <w:pPr>
-              <w:spacing w:before="0" w:after="0" w:line="240" w:lineRule="auto"/>
+              <w:spacing w:after="0" w:line="240" w:lineRule="auto"/>
               <w:jc w:val="center"/>
-              <w:rPr>
-                <w:rFonts w:hint="eastAsia"/>
-              </w:rPr>
             </w:pPr>
             <w:r>
               <w:rPr>
@@ -3120,10 +2723,7 @@
           </w:tcPr>
           <w:p>
             <w:pPr>
-              <w:spacing w:before="0" w:after="0" w:line="240" w:lineRule="auto"/>
-              <w:rPr>
-                <w:rFonts w:hint="eastAsia"/>
-              </w:rPr>
+              <w:spacing w:after="0" w:line="240" w:lineRule="auto"/>
             </w:pPr>
             <w:r>
               <w:rPr>
@@ -3154,17 +2754,21 @@
           </w:tcPr>
           <w:p>
             <w:pPr>
-              <w:spacing w:before="0" w:after="0" w:line="240" w:lineRule="auto"/>
-              <w:rPr>
-                <w:rFonts w:hint="eastAsia"/>
-              </w:rPr>
+              <w:spacing w:after="0" w:line="240" w:lineRule="auto"/>
             </w:pPr>
             <w:r>
               <w:rPr>
                 <w:rFonts w:eastAsia="Georgia"/>
                 <w:sz w:val="18"/>
               </w:rPr>
-              <w:t>provjerava osnovne RV32I instrukcije i sluzi da se vidi da prosirenja nisu pokvarila bazu</w:t>
+              <w:t>provjerava osnovne RV32I instrukcije i sluzi da se vidi da prosirenja nisu pokvarila</w:t>
+            </w:r>
+            <w:r>
+              <w:rPr>
+                <w:rFonts w:eastAsia="Georgia"/>
+                <w:sz w:val="18"/>
+              </w:rPr>
+              <w:t xml:space="preserve"> osnovu</w:t>
             </w:r>
           </w:p>
         </w:tc>
@@ -3192,10 +2796,7 @@
           </w:tcPr>
           <w:p>
             <w:pPr>
-              <w:spacing w:before="0" w:after="0" w:line="240" w:lineRule="auto"/>
-              <w:rPr>
-                <w:rFonts w:hint="eastAsia"/>
-              </w:rPr>
+              <w:spacing w:after="0" w:line="240" w:lineRule="auto"/>
             </w:pPr>
             <w:r>
               <w:rPr>
@@ -3226,10 +2827,7 @@
           </w:tcPr>
           <w:p>
             <w:pPr>
-              <w:spacing w:before="0" w:after="0" w:line="240" w:lineRule="auto"/>
-              <w:rPr>
-                <w:rFonts w:hint="eastAsia"/>
-              </w:rPr>
+              <w:spacing w:after="0" w:line="240" w:lineRule="auto"/>
             </w:pPr>
             <w:r>
               <w:rPr>
@@ -3264,10 +2862,7 @@
           </w:tcPr>
           <w:p>
             <w:pPr>
-              <w:spacing w:before="0" w:after="0" w:line="240" w:lineRule="auto"/>
-              <w:rPr>
-                <w:rFonts w:hint="eastAsia"/>
-              </w:rPr>
+              <w:spacing w:after="0" w:line="240" w:lineRule="auto"/>
             </w:pPr>
             <w:r>
               <w:rPr>
@@ -3298,10 +2893,7 @@
           </w:tcPr>
           <w:p>
             <w:pPr>
-              <w:spacing w:before="0" w:after="0" w:line="240" w:lineRule="auto"/>
-              <w:rPr>
-                <w:rFonts w:hint="eastAsia"/>
-              </w:rPr>
+              <w:spacing w:after="0" w:line="240" w:lineRule="auto"/>
             </w:pPr>
             <w:r>
               <w:rPr>
@@ -3317,17 +2909,11 @@
     <w:p>
       <w:pPr>
         <w:spacing w:after="20"/>
-        <w:rPr>
-          <w:rFonts w:hint="eastAsia"/>
-        </w:rPr>
       </w:pPr>
     </w:p>
     <w:p>
       <w:pPr>
-        <w:spacing w:after="60" w:line="240" w:lineRule="auto" w:before="0"/>
-        <w:rPr>
-          <w:rFonts w:hint="eastAsia"/>
-        </w:rPr>
+        <w:spacing w:after="60" w:line="240" w:lineRule="auto"/>
       </w:pPr>
       <w:r>
         <w:rPr>
@@ -3338,581 +2924,449 @@
     </w:p>
     <w:p>
       <w:pPr>
-        <w:keepNext/>
-        <w:spacing w:before="0" w:after="60" w:line="240" w:lineRule="auto"/>
-        <w:rPr>
-          <w:rFonts w:hint="eastAsia"/>
-        </w:rPr>
-      </w:pPr>
-      <w:r>
-        <w:rPr>
-          <w:rFonts w:eastAsia="Georgia"/>
-          <w:b/>
-          <w:color w:val="634984"/>
-          <w:sz w:val="34"/>
-        </w:rPr>
-        <w:t>8. provjera u vivadu</w:t>
-      </w:r>
-    </w:p>
-    <w:p>
-      <w:pPr>
-        <w:spacing w:after="60" w:line="240" w:lineRule="auto" w:before="0"/>
-        <w:rPr>
-          <w:rFonts w:hint="eastAsia"/>
-        </w:rPr>
-      </w:pPr>
-      <w:r>
-        <w:rPr>
-          <w:rFonts w:eastAsia="Georgia"/>
-        </w:rPr>
-        <w:t>Provjera projekta u Vivadu radi se kroz Behavioral Simulation, gdje je top testbench TOP_testovi. Testbench ucitava program u instrukcionu memoriju, upisuje pocetne podatke u data memoriju i zatim prati store operacije koje procesor pravi</w:t>
-      </w:r>
-    </w:p>
-    <w:p>
-      <w:pPr>
-        <w:spacing w:after="60" w:line="240" w:lineRule="auto" w:before="0"/>
-        <w:rPr>
-          <w:rFonts w:hint="eastAsia"/>
-        </w:rPr>
-      </w:pPr>
-      <w:r>
-        <w:rPr>
-          <w:rFonts w:eastAsia="Georgia"/>
-        </w:rPr>
-        <w:t>Ako je simulacija uspjesna, u Tcl konzoli treba da se pojavi poruka za scenario koji je pokrenut:</w:t>
-      </w:r>
-    </w:p>
-    <w:p>
-      <w:pPr>
-        <w:spacing w:after="60" w:line="240" w:lineRule="auto" w:before="0"/>
-        <w:rPr>
-          <w:rFonts w:hint="eastAsia"/>
-        </w:rPr>
-      </w:pPr>
-      <w:r>
-        <w:rPr>
-          <w:rFonts w:eastAsia="Georgia"/>
-        </w:rPr>
-        <w:t>- za osnovni RV32I scenario: rv32i regression CPU test passed</w:t>
-      </w:r>
-    </w:p>
-    <w:p>
-      <w:pPr>
-        <w:spacing w:after="60" w:line="240" w:lineRule="auto" w:before="0"/>
-        <w:rPr>
-          <w:rFonts w:hint="eastAsia"/>
-        </w:rPr>
-      </w:pPr>
-      <w:r>
-        <w:rPr>
-          <w:rFonts w:eastAsia="Georgia"/>
-        </w:rPr>
-        <w:t>- za Zbb scenario: Zbb CPU demo test passed</w:t>
-      </w:r>
-    </w:p>
-    <w:p>
-      <w:pPr>
-        <w:spacing w:after="60" w:line="240" w:lineRule="auto" w:before="0"/>
-        <w:rPr>
-          <w:rFonts w:hint="eastAsia"/>
-        </w:rPr>
-      </w:pPr>
-      <w:r>
-        <w:rPr>
-          <w:rFonts w:eastAsia="Georgia"/>
-        </w:rPr>
-        <w:t>- za prosireni scenario: Extended CPU demo test passed</w:t>
-      </w:r>
-    </w:p>
-    <w:p>
-      <w:pPr>
-        <w:spacing w:after="60" w:line="240" w:lineRule="auto" w:before="0"/>
-        <w:rPr>
-          <w:rFonts w:hint="eastAsia"/>
-        </w:rPr>
-      </w:pPr>
-      <w:r>
-        <w:rPr>
-          <w:rFonts w:eastAsia="Georgia"/>
-        </w:rPr>
-        <w:t>Ako adresa ili podatak kod store operacije nisu tacni, testbench prekida simulaciju preko assert failure poruke. Zbog toga je za provjeru najbitnije gledati Tcl konzolu i waveform signale PC-a, instrukcije, ALU operacije, write enable signala i podataka koji se upisuju u memoriju</w:t>
-      </w:r>
-    </w:p>
-    <w:p>
-      <w:pPr>
-        <w:spacing w:before="120" w:after="80" w:line="240" w:lineRule="auto"/>
+        <w:spacing w:after="160" w:before="160" w:line="252" w:lineRule="auto"/>
       </w:pPr>
       <w:r>
         <w:rPr>
           <w:rFonts w:ascii="Calibri" w:hAnsi="Calibri"/>
           <w:b/>
-          <w:sz w:val="24"/>
+          <w:i w:val="0"/>
+          <w:color w:val="0B2E6D"/>
+          <w:sz w:val="30"/>
         </w:rPr>
-        <w:t>8.1 rezultati provjere (09.05.2026)</w:t>
+        <w:t>8. provjera i rezultati testova</w:t>
       </w:r>
     </w:p>
     <w:p>
       <w:pPr>
-        <w:spacing w:before="0" w:after="60" w:line="240" w:lineRule="auto"/>
+        <w:spacing w:after="80" w:before="0" w:line="252" w:lineRule="auto"/>
       </w:pPr>
       <w:r>
         <w:rPr>
           <w:rFonts w:ascii="Calibri" w:hAnsi="Calibri"/>
           <w:b w:val="0"/>
-          <w:sz w:val="22"/>
+          <w:i w:val="0"/>
+          <w:color w:val="111111"/>
+          <w:sz w:val="21"/>
         </w:rPr>
-        <w:t>Projekat je pokrenut i provjeren kompletno iz batch okruzenja. Dokaz nije samo otvaranje projekta, nego sinteza plus testbench poruke koje nastaju tek kada su ocekivani store rezultati prosli bez assert failure greske.</w:t>
+        <w:t>Na kraju projekta provjera je svedena na dvije prenosive skripte: jedna pravi Vivado projekat iz GUI-ja, a druga pokrece GHDL testove iz komandne linije. U skriptama nema mojih lokalnih Windows putanja, tako da se folder moze poslati i otvoriti na drugom racunaru.</w:t>
       </w:r>
     </w:p>
     <w:p>
       <w:pPr>
-        <w:spacing w:before="0" w:after="60" w:line="240" w:lineRule="auto"/>
+        <w:spacing w:after="100" w:before="160" w:line="252" w:lineRule="auto"/>
+      </w:pPr>
+      <w:r>
+        <w:rPr>
+          <w:rFonts w:ascii="Calibri" w:hAnsi="Calibri"/>
+          <w:b/>
+          <w:i w:val="0"/>
+          <w:color w:val="0B2E6D"/>
+          <w:sz w:val="25"/>
+        </w:rPr>
+        <w:t>8.1 pokretanje Vivado projekta</w:t>
+      </w:r>
+    </w:p>
+    <w:p>
+      <w:pPr>
+        <w:spacing w:after="80" w:before="0" w:line="252" w:lineRule="auto"/>
       </w:pPr>
       <w:r>
         <w:rPr>
           <w:rFonts w:ascii="Calibri" w:hAnsi="Calibri"/>
           <w:b w:val="0"/>
-          <w:sz w:val="22"/>
+          <w:i w:val="0"/>
+          <w:color w:val="111111"/>
+          <w:sz w:val="21"/>
         </w:rPr>
-        <w:t>Pokrenute komande:</w:t>
+        <w:t>Vivado projekat se ne salje kao rucno pravljen lokalni .xpr, nego se ponovo napravi iz Tcl skripte. U Vivado GUI-ju treba izabrati Tools -&gt; Run Tcl Script... i pokrenuti skriptu iz glavnog projektnog foldera:</w:t>
       </w:r>
     </w:p>
     <w:p>
       <w:pPr>
-        <w:spacing w:before="0" w:after="60" w:line="240" w:lineRule="auto"/>
+        <w:spacing w:after="100" w:before="40" w:line="252" w:lineRule="auto"/>
+        <w:ind w:left="259"/>
+      </w:pPr>
+      <w:r>
+        <w:rPr>
+          <w:rFonts w:ascii="Courier New" w:hAnsi="Courier New"/>
+          <w:color w:val="000000"/>
+          <w:sz w:val="17"/>
+        </w:rPr>
+        <w:t>03_PROJEKAT_RISCV_VHDL_ZBB/RISCV.tcl</w:t>
+      </w:r>
+    </w:p>
+    <w:p>
+      <w:pPr>
+        <w:spacing w:after="80" w:before="0" w:line="252" w:lineRule="auto"/>
       </w:pPr>
       <w:r>
         <w:rPr>
           <w:rFonts w:ascii="Calibri" w:hAnsi="Calibri"/>
           <w:b w:val="0"/>
-          <w:sz w:val="22"/>
+          <w:i w:val="0"/>
+          <w:color w:val="111111"/>
+          <w:sz w:val="21"/>
         </w:rPr>
-        <w:t>- GHDL: powershell -ExecutionPolicy Bypass -File .\scripts\run_ghdl_tests.ps1 -Scenario all</w:t>
+        <w:t>Skripta sama nadje svoj folder, napravi projekat u rv32i/vivado_projekat, doda VHDL izvore, testbench fajlove i test programe, postavi TOP_RISCV kao glavni modul i TOP_testovi kao simulacioni top. Poslije toga je projekat vec otvoren u Vivado GUI-ju, a simulacija se moze pokrenuti kroz Flow Navigator -&gt; Simulation -&gt; Run Simulation -&gt; Run Behavioral Simulation.</w:t>
       </w:r>
     </w:p>
     <w:p>
       <w:pPr>
-        <w:spacing w:before="0" w:after="60" w:line="240" w:lineRule="auto"/>
+        <w:spacing w:after="80" w:before="0" w:line="252" w:lineRule="auto"/>
       </w:pPr>
       <w:r>
         <w:rPr>
           <w:rFonts w:ascii="Calibri" w:hAnsi="Calibri"/>
           <w:b w:val="0"/>
-          <w:sz w:val="22"/>
+          <w:i w:val="0"/>
+          <w:color w:val="111111"/>
+          <w:sz w:val="21"/>
         </w:rPr>
-        <w:t>- Vivado: powershell -ExecutionPolicy Bypass -File .\scripts\run_vivado_checks.ps1 -Scenario all</w:t>
+        <w:t>Podrazumijevani GUI scenario u skripti je Zbb demo: SCENARIO_ID_G=1 i PROGRAM_PATH_G=../../../../../testovi/test_programi/zbb_demo.txt. Za ostale scenarije koriste se isti testbench i isti programi iz rv32i/testovi/test_programi.</w:t>
       </w:r>
     </w:p>
     <w:p>
       <w:pPr>
-        <w:spacing w:before="0" w:after="60" w:line="240" w:lineRule="auto"/>
+        <w:spacing w:after="100" w:before="160" w:line="252" w:lineRule="auto"/>
+      </w:pPr>
+      <w:r>
+        <w:rPr>
+          <w:rFonts w:ascii="Calibri" w:hAnsi="Calibri"/>
+          <w:b/>
+          <w:i w:val="0"/>
+          <w:color w:val="0B2E6D"/>
+          <w:sz w:val="25"/>
+        </w:rPr>
+        <w:t>8.2 pokretanje GHDL testova</w:t>
+      </w:r>
+    </w:p>
+    <w:p>
+      <w:pPr>
+        <w:spacing w:after="80" w:before="0" w:line="252" w:lineRule="auto"/>
       </w:pPr>
       <w:r>
         <w:rPr>
           <w:rFonts w:ascii="Calibri" w:hAnsi="Calibri"/>
           <w:b w:val="0"/>
-          <w:sz w:val="22"/>
+          <w:i w:val="0"/>
+          <w:color w:val="111111"/>
+          <w:sz w:val="21"/>
         </w:rPr>
-        <w:t>Rezultat provjere:</w:t>
+        <w:t>Za brzu provjeru bez Vivado GUI-ja koristi se PowerShell skripta:</w:t>
       </w:r>
     </w:p>
     <w:p>
       <w:pPr>
-        <w:spacing w:before="0" w:after="60" w:line="240" w:lineRule="auto"/>
+        <w:spacing w:after="100" w:before="40" w:line="252" w:lineRule="auto"/>
+        <w:ind w:left="259"/>
+      </w:pPr>
+      <w:r>
+        <w:rPr>
+          <w:rFonts w:ascii="Courier New" w:hAnsi="Courier New"/>
+          <w:color w:val="000000"/>
+          <w:sz w:val="17"/>
+        </w:rPr>
+        <w:t>powershell -ExecutionPolicy Bypass -File .\scripts\run_ghdl_tests.ps1 -Scenario all</w:t>
+      </w:r>
+    </w:p>
+    <w:p>
+      <w:pPr>
+        <w:spacing w:after="80" w:before="0" w:line="252" w:lineRule="auto"/>
       </w:pPr>
       <w:r>
         <w:rPr>
           <w:rFonts w:ascii="Calibri" w:hAnsi="Calibri"/>
           <w:b w:val="0"/>
-          <w:sz w:val="22"/>
+          <w:i w:val="0"/>
+          <w:color w:val="111111"/>
+          <w:sz w:val="21"/>
         </w:rPr>
-        <w:t>- Vivado 2025.2, ciljna komponenta xc7z010clg400-1</w:t>
+        <w:t>Skripta kompajlira sve VHDL fajlove sa --std=08 i pokrece cetiri provjere: ALU prosirene operacije, Zbb CPU demo, prosireni CPU demo i RV32I regresioni test. Rezultat se upisuje u output/ghdl_latest.log.</w:t>
       </w:r>
     </w:p>
     <w:p>
       <w:pPr>
-        <w:spacing w:before="0" w:after="60" w:line="240" w:lineRule="auto"/>
+        <w:spacing w:after="100" w:before="160" w:line="252" w:lineRule="auto"/>
+      </w:pPr>
+      <w:r>
+        <w:rPr>
+          <w:rFonts w:ascii="Calibri" w:hAnsi="Calibri"/>
+          <w:b/>
+          <w:i w:val="0"/>
+          <w:color w:val="0B2E6D"/>
+          <w:sz w:val="25"/>
+        </w:rPr>
+        <w:t>8.3 dokaz rezultata</w:t>
+      </w:r>
+    </w:p>
+    <w:p>
+      <w:pPr>
+        <w:spacing w:after="80" w:before="0" w:line="252" w:lineRule="auto"/>
       </w:pPr>
       <w:r>
         <w:rPr>
           <w:rFonts w:ascii="Calibri" w:hAnsi="Calibri"/>
           <w:b w:val="0"/>
-          <w:sz w:val="22"/>
+          <w:i w:val="0"/>
+          <w:color w:val="111111"/>
+          <w:sz w:val="21"/>
         </w:rPr>
-        <w:t>- sinteza: SYNTH_STATUS=synth_design Complete!</w:t>
+        <w:t>GHDL provjera je ponovo pokrenuta nad trenutnim projektom. Relevantne pass poruke iz loga su:</w:t>
       </w:r>
     </w:p>
     <w:p>
       <w:pPr>
-        <w:spacing w:before="0" w:after="60" w:line="240" w:lineRule="auto"/>
+        <w:spacing w:after="100" w:before="40" w:line="252" w:lineRule="auto"/>
+        <w:ind w:left="259"/>
+      </w:pPr>
+      <w:r>
+        <w:rPr>
+          <w:rFonts w:ascii="Courier New" w:hAnsi="Courier New"/>
+          <w:color w:val="000000"/>
+          <w:sz w:val="17"/>
+        </w:rPr>
+        <w:t>ALU extended tests passed</w:t>
+        <w:br/>
+        <w:t>Zbb CPU demo test passed</w:t>
+        <w:br/>
+        <w:t>Extended CPU demo test passed</w:t>
+        <w:br/>
+        <w:t>rv32i regression CPU test passed</w:t>
+        <w:br/>
+        <w:t>Svi trazeni GHDL testovi su prosli.</w:t>
+      </w:r>
+    </w:p>
+    <w:p>
+      <w:pPr>
+        <w:spacing w:after="80" w:before="0" w:line="252" w:lineRule="auto"/>
       </w:pPr>
       <w:r>
         <w:rPr>
           <w:rFonts w:ascii="Calibri" w:hAnsi="Calibri"/>
           <w:b w:val="0"/>
-          <w:sz w:val="22"/>
+          <w:i w:val="0"/>
+          <w:color w:val="111111"/>
+          <w:sz w:val="21"/>
         </w:rPr>
-        <w:t>- ALU test: ALU extended tests passed</w:t>
+        <w:t>Vivado dokaz je sacuvan u output/vivado_latest.log. U njemu se vidi da je sinteza prosla i da su simulacioni scenariji zavrseni bez pada testa:</w:t>
       </w:r>
     </w:p>
     <w:p>
       <w:pPr>
-        <w:spacing w:before="0" w:after="60" w:line="240" w:lineRule="auto"/>
+        <w:spacing w:after="100" w:before="40" w:line="252" w:lineRule="auto"/>
+        <w:ind w:left="259"/>
+      </w:pPr>
+      <w:r>
+        <w:rPr>
+          <w:rFonts w:ascii="Courier New" w:hAnsi="Courier New"/>
+          <w:color w:val="000000"/>
+          <w:sz w:val="17"/>
+        </w:rPr>
+        <w:t>SYNTH_STATUS=synth_design Complete!</w:t>
+        <w:br/>
+        <w:t>Note: ALU extended tests passed</w:t>
+        <w:br/>
+        <w:t>Note: Zbb CPU demo test passed</w:t>
+        <w:br/>
+        <w:t>Note: rv32i regression CPU test passed</w:t>
+        <w:br/>
+        <w:t>Note: Extended CPU demo test passed</w:t>
+        <w:br/>
+        <w:t>Vivado checks completed successfully.</w:t>
+      </w:r>
+    </w:p>
+    <w:p>
+      <w:pPr>
+        <w:spacing w:after="80" w:before="0" w:line="252" w:lineRule="auto"/>
       </w:pPr>
       <w:r>
         <w:rPr>
           <w:rFonts w:ascii="Calibri" w:hAnsi="Calibri"/>
           <w:b w:val="0"/>
-          <w:sz w:val="22"/>
+          <w:i w:val="0"/>
+          <w:color w:val="111111"/>
+          <w:sz w:val="21"/>
         </w:rPr>
-        <w:t>- Zbb CPU demo: Zbb CPU demo test passed</w:t>
+        <w:t>U logovima se mogu pojaviti numeric_std metavalue upozorenja na pocetku simulacije. To su upozorenja zbog pocetnih nepoznatih vrijednosti signala i nisu pad testa. Pravi pad bi se vidio kroz assert/error i skripta se tada ne bi zavrsila pass porukom.</w:t>
       </w:r>
     </w:p>
     <w:p>
       <w:pPr>
-        <w:spacing w:before="0" w:after="60" w:line="240" w:lineRule="auto"/>
+        <w:spacing w:after="100" w:before="160" w:line="252" w:lineRule="auto"/>
+      </w:pPr>
+      <w:r>
+        <w:rPr>
+          <w:rFonts w:ascii="Calibri" w:hAnsi="Calibri"/>
+          <w:b/>
+          <w:i w:val="0"/>
+          <w:color w:val="0B2E6D"/>
+          <w:sz w:val="25"/>
+        </w:rPr>
+        <w:t>8.4 waveform dokaz iz Vivada</w:t>
+      </w:r>
+    </w:p>
+    <w:p>
+      <w:pPr>
+        <w:spacing w:after="80" w:before="0" w:line="252" w:lineRule="auto"/>
       </w:pPr>
       <w:r>
         <w:rPr>
           <w:rFonts w:ascii="Calibri" w:hAnsi="Calibri"/>
           <w:b w:val="0"/>
-          <w:sz w:val="22"/>
+          <w:i w:val="0"/>
+          <w:color w:val="111111"/>
+          <w:sz w:val="21"/>
         </w:rPr>
-        <w:t>- RV32I regresija: rv32i regression CPU test passed</w:t>
+        <w:t>Na sljedecim slikama je Vivado waveform iz behavioral simulacije. Oznake na slici izdvajaju dijelove koji su bitni za dokaz rada testbencha.</w:t>
       </w:r>
     </w:p>
     <w:p>
       <w:pPr>
-        <w:spacing w:before="0" w:after="60" w:line="240" w:lineRule="auto"/>
+        <w:spacing w:after="40"/>
+        <w:jc w:val="center"/>
+      </w:pPr>
+      <w:r>
+        <w:drawing>
+          <wp:inline xmlns:a="http://schemas.openxmlformats.org/drawingml/2006/main" xmlns:pic="http://schemas.openxmlformats.org/drawingml/2006/picture">
+            <wp:extent cx="5806440" cy="2805837"/>
+            <wp:docPr id="3" name="Picture 3"/>
+            <wp:cNvGraphicFramePr>
+              <a:graphicFrameLocks noChangeAspect="1"/>
+            </wp:cNvGraphicFramePr>
+            <a:graphic>
+              <a:graphicData uri="http://schemas.openxmlformats.org/drawingml/2006/picture">
+                <pic:pic>
+                  <pic:nvPicPr>
+                    <pic:cNvPr id="0" name="vivado_waveform_01_annotated.png"/>
+                    <pic:cNvPicPr/>
+                  </pic:nvPicPr>
+                  <pic:blipFill>
+                    <a:blip r:embed="rId14"/>
+                    <a:stretch>
+                      <a:fillRect/>
+                    </a:stretch>
+                  </pic:blipFill>
+                  <pic:spPr>
+                    <a:xfrm>
+                      <a:off x="0" y="0"/>
+                      <a:ext cx="5806440" cy="2805837"/>
+                    </a:xfrm>
+                    <a:prstGeom prst="rect"/>
+                  </pic:spPr>
+                </pic:pic>
+              </a:graphicData>
+            </a:graphic>
+          </wp:inline>
+        </w:drawing>
+      </w:r>
+    </w:p>
+    <w:p>
+      <w:pPr>
+        <w:spacing w:after="100"/>
+        <w:jc w:val="center"/>
       </w:pPr>
       <w:r>
         <w:rPr>
           <w:rFonts w:ascii="Calibri" w:hAnsi="Calibri"/>
           <w:b w:val="0"/>
-          <w:sz w:val="22"/>
+          <w:i/>
+          <w:color w:val="333333"/>
+          <w:sz w:val="18"/>
         </w:rPr>
-        <w:t>- prosireni CPU demo: Extended CPU demo test passed</w:t>
+        <w:t>Slika 8.1 - Vivado waveform: ucitavanje instrukcija, izbor scenarija i ulazni test podaci.</w:t>
       </w:r>
     </w:p>
     <w:p>
       <w:pPr>
-        <w:spacing w:before="0" w:after="60" w:line="240" w:lineRule="auto"/>
+        <w:spacing w:after="80" w:before="0" w:line="252" w:lineRule="auto"/>
       </w:pPr>
       <w:r>
         <w:rPr>
           <w:rFonts w:ascii="Calibri" w:hAnsi="Calibri"/>
           <w:b w:val="0"/>
-          <w:sz w:val="22"/>
+          <w:i w:val="0"/>
+          <w:color w:val="111111"/>
+          <w:sz w:val="21"/>
         </w:rPr>
-        <w:t>- u Vivado logu je zabiljezeno 78 linija CPU store observed; testbench za svaki store poredi adresu i podatak sa ocekivanim nizovima.</w:t>
+        <w:t>Oznaka 1 pokazuje takt, reset i dozvolu upisa pri inicijalizaciji. Oznaka 2 pokazuje adrese i podatke koji se upisuju u instrukcionu memoriju. Oznaka 3 pokazuje koji test scenario i program su aktivni. Oznaka 4 pokazuje ulazne podatke koji se kasnije koriste za provjeru rezultata procesora.</w:t>
       </w:r>
     </w:p>
     <w:p>
       <w:pPr>
-        <w:spacing w:before="0" w:after="60" w:line="240" w:lineRule="auto"/>
+        <w:spacing w:after="40"/>
+        <w:jc w:val="center"/>
+      </w:pPr>
+      <w:r>
+        <w:drawing>
+          <wp:inline xmlns:a="http://schemas.openxmlformats.org/drawingml/2006/main" xmlns:pic="http://schemas.openxmlformats.org/drawingml/2006/picture">
+            <wp:extent cx="5806440" cy="2671936"/>
+            <wp:docPr id="4" name="Picture 4"/>
+            <wp:cNvGraphicFramePr>
+              <a:graphicFrameLocks noChangeAspect="1"/>
+            </wp:cNvGraphicFramePr>
+            <a:graphic>
+              <a:graphicData uri="http://schemas.openxmlformats.org/drawingml/2006/picture">
+                <pic:pic>
+                  <pic:nvPicPr>
+                    <pic:cNvPr id="0" name="vivado_waveform_02_annotated.png"/>
+                    <pic:cNvPicPr/>
+                  </pic:nvPicPr>
+                  <pic:blipFill>
+                    <a:blip r:embed="rId15"/>
+                    <a:stretch>
+                      <a:fillRect/>
+                    </a:stretch>
+                  </pic:blipFill>
+                  <pic:spPr>
+                    <a:xfrm>
+                      <a:off x="0" y="0"/>
+                      <a:ext cx="5806440" cy="2671936"/>
+                    </a:xfrm>
+                    <a:prstGeom prst="rect"/>
+                  </pic:spPr>
+                </pic:pic>
+              </a:graphicData>
+            </a:graphic>
+          </wp:inline>
+        </w:drawing>
+      </w:r>
+    </w:p>
+    <w:p>
+      <w:pPr>
+        <w:spacing w:after="100"/>
+        <w:jc w:val="center"/>
       </w:pPr>
       <w:r>
         <w:rPr>
           <w:rFonts w:ascii="Calibri" w:hAnsi="Calibri"/>
           <w:b w:val="0"/>
-          <w:sz w:val="22"/>
+          <w:i/>
+          <w:color w:val="333333"/>
+          <w:sz w:val="18"/>
         </w:rPr>
-        <w:t>Izvod iz Vivado Tcl konzole:</w:t>
+        <w:t>Slika 8.2 - Vivado waveform: ocekivani rezultati za RV32I, Zbb i prosireni scenario.</w:t>
       </w:r>
     </w:p>
     <w:p>
       <w:pPr>
-        <w:spacing w:before="0" w:after="20" w:line="240" w:lineRule="auto"/>
-      </w:pPr>
-      <w:r>
-        <w:rPr>
-          <w:rFonts w:ascii="Consolas" w:hAnsi="Consolas"/>
-          <w:b w:val="0"/>
-          <w:sz w:val="18"/>
-        </w:rPr>
-        <w:t># Vivado v2025.2 (64-bit)</w:t>
-      </w:r>
-    </w:p>
-    <w:p>
-      <w:pPr>
-        <w:spacing w:before="0" w:after="20" w:line="240" w:lineRule="auto"/>
-      </w:pPr>
-      <w:r>
-        <w:rPr>
-          <w:rFonts w:ascii="Consolas" w:hAnsi="Consolas"/>
-          <w:b w:val="0"/>
-          <w:sz w:val="18"/>
-        </w:rPr>
-        <w:t>Running Vivado synthesis check...</w:t>
-      </w:r>
-    </w:p>
-    <w:p>
-      <w:pPr>
-        <w:spacing w:before="0" w:after="20" w:line="240" w:lineRule="auto"/>
-      </w:pPr>
-      <w:r>
-        <w:rPr>
-          <w:rFonts w:ascii="Consolas" w:hAnsi="Consolas"/>
-          <w:b w:val="0"/>
-          <w:sz w:val="18"/>
-        </w:rPr>
-        <w:t>SYNTH_STATUS=synth_design Complete!</w:t>
-      </w:r>
-    </w:p>
-    <w:p>
-      <w:pPr>
-        <w:spacing w:before="0" w:after="20" w:line="240" w:lineRule="auto"/>
-      </w:pPr>
-      <w:r>
-        <w:rPr>
-          <w:rFonts w:ascii="Consolas" w:hAnsi="Consolas"/>
-          <w:b w:val="0"/>
-          <w:sz w:val="18"/>
-        </w:rPr>
-        <w:t>Running Vivado behavioral simulation for ALU_zbb_tb...</w:t>
-      </w:r>
-    </w:p>
-    <w:p>
-      <w:pPr>
-        <w:spacing w:before="0" w:after="20" w:line="240" w:lineRule="auto"/>
-      </w:pPr>
-      <w:r>
-        <w:rPr>
-          <w:rFonts w:ascii="Consolas" w:hAnsi="Consolas"/>
-          <w:b w:val="0"/>
-          <w:sz w:val="18"/>
-        </w:rPr>
-        <w:t>Note: ALU extended tests passed</w:t>
-      </w:r>
-    </w:p>
-    <w:p>
-      <w:pPr>
-        <w:spacing w:before="0" w:after="20" w:line="240" w:lineRule="auto"/>
-      </w:pPr>
-      <w:r>
-        <w:rPr>
-          <w:rFonts w:ascii="Consolas" w:hAnsi="Consolas"/>
-          <w:b w:val="0"/>
-          <w:sz w:val="18"/>
-        </w:rPr>
-        <w:t>Running Vivado behavioral simulation for TOP_testovi...</w:t>
-      </w:r>
-    </w:p>
-    <w:p>
-      <w:pPr>
-        <w:spacing w:before="0" w:after="20" w:line="240" w:lineRule="auto"/>
-      </w:pPr>
-      <w:r>
-        <w:rPr>
-          <w:rFonts w:ascii="Consolas" w:hAnsi="Consolas"/>
-          <w:b w:val="0"/>
-          <w:sz w:val="18"/>
-        </w:rPr>
-        <w:t>Note: Zbb CPU demo test passed</w:t>
-      </w:r>
-    </w:p>
-    <w:p>
-      <w:pPr>
-        <w:spacing w:before="0" w:after="20" w:line="240" w:lineRule="auto"/>
-      </w:pPr>
-      <w:r>
-        <w:rPr>
-          <w:rFonts w:ascii="Consolas" w:hAnsi="Consolas"/>
-          <w:b w:val="0"/>
-          <w:sz w:val="18"/>
-        </w:rPr>
-        <w:t>Running Vivado behavioral simulation for TOP_testovi...</w:t>
-      </w:r>
-    </w:p>
-    <w:p>
-      <w:pPr>
-        <w:spacing w:before="0" w:after="20" w:line="240" w:lineRule="auto"/>
-      </w:pPr>
-      <w:r>
-        <w:rPr>
-          <w:rFonts w:ascii="Consolas" w:hAnsi="Consolas"/>
-          <w:b w:val="0"/>
-          <w:sz w:val="18"/>
-        </w:rPr>
-        <w:t>Note: rv32i regression CPU test passed</w:t>
-      </w:r>
-    </w:p>
-    <w:p>
-      <w:pPr>
-        <w:spacing w:before="0" w:after="20" w:line="240" w:lineRule="auto"/>
-      </w:pPr>
-      <w:r>
-        <w:rPr>
-          <w:rFonts w:ascii="Consolas" w:hAnsi="Consolas"/>
-          <w:b w:val="0"/>
-          <w:sz w:val="18"/>
-        </w:rPr>
-        <w:t>Running Vivado behavioral simulation for TOP_testovi...</w:t>
-      </w:r>
-    </w:p>
-    <w:p>
-      <w:pPr>
-        <w:spacing w:before="0" w:after="20" w:line="240" w:lineRule="auto"/>
-      </w:pPr>
-      <w:r>
-        <w:rPr>
-          <w:rFonts w:ascii="Consolas" w:hAnsi="Consolas"/>
-          <w:b w:val="0"/>
-          <w:sz w:val="18"/>
-        </w:rPr>
-        <w:t>Note: Extended CPU demo test passed</w:t>
-      </w:r>
-    </w:p>
-    <w:p>
-      <w:pPr>
-        <w:spacing w:before="0" w:after="20" w:line="240" w:lineRule="auto"/>
-      </w:pPr>
-      <w:r>
-        <w:rPr>
-          <w:rFonts w:ascii="Consolas" w:hAnsi="Consolas"/>
-          <w:b w:val="0"/>
-          <w:sz w:val="18"/>
-        </w:rPr>
-        <w:t>Vivado checks completed successfully.</w:t>
-      </w:r>
-    </w:p>
-    <w:p>
-      <w:pPr>
-        <w:spacing w:before="0" w:after="60" w:line="240" w:lineRule="auto"/>
+        <w:spacing w:after="80" w:before="0" w:line="252" w:lineRule="auto"/>
       </w:pPr>
       <w:r>
         <w:rPr>
           <w:rFonts w:ascii="Calibri" w:hAnsi="Calibri"/>
           <w:b w:val="0"/>
-          <w:sz w:val="22"/>
+          <w:i w:val="0"/>
+          <w:color w:val="111111"/>
+          <w:sz w:val="21"/>
         </w:rPr>
-        <w:t>Detaljni logovi su sacuvani u output/vivado_all_2026-05-09.log i output/ghdl_all_2026-05-09.log.</w:t>
-      </w:r>
-    </w:p>
-    <w:p>
-      <w:pPr>
-        <w:spacing w:before="0" w:after="60" w:line="240" w:lineRule="auto"/>
-      </w:pPr>
-      <w:r>
-        <w:rPr>
-          <w:rFonts w:ascii="Calibri" w:hAnsi="Calibri"/>
-          <w:b w:val="0"/>
-          <w:sz w:val="22"/>
-        </w:rPr>
-        <w:t>Napomena: GHDL/Vivado prikazuju numeric_std metavalue upozorenja na pocetku simulacije. Ona nisu pad testa, jer simulacija nastavlja rad i zavrsava se pass porukama. Pravi pad bi bio assert failure iz testbencha.</w:t>
-      </w:r>
-    </w:p>
-    <w:p>
-      <w:pPr>
-        <w:spacing w:before="0" w:after="80" w:line="240" w:lineRule="auto"/>
-      </w:pPr>
-      <w:r>
-        <w:rPr>
-          <w:rFonts w:ascii="Calibri" w:hAnsi="Calibri"/>
-          <w:b/>
-          <w:sz w:val="24"/>
-        </w:rPr>
-        <w:t>8.2 uputstvo za Vivado i screenshot dokaz</w:t>
-      </w:r>
-    </w:p>
-    <w:p>
-      <w:pPr>
-        <w:spacing w:before="0" w:after="60" w:line="240" w:lineRule="auto"/>
-      </w:pPr>
-      <w:r>
-        <w:rPr>
-          <w:rFonts w:ascii="Calibri" w:hAnsi="Calibri"/>
-          <w:b w:val="0"/>
-          <w:sz w:val="22"/>
-        </w:rPr>
-        <w:t>Za rucno otvaranje projekta u Vivadu treba pokrenuti Vivado 2025.2, izabrati Open Project i otvoriti rv32i/vivado_projekat/vivado_projekat.xpr. Upozorenje o dugoj putanji nije VHDL greska i moze se nastaviti.</w:t>
-      </w:r>
-    </w:p>
-    <w:p>
-      <w:pPr>
-        <w:spacing w:before="0" w:after="60" w:line="240" w:lineRule="auto"/>
-      </w:pPr>
-      <w:r>
-        <w:rPr>
-          <w:rFonts w:ascii="Calibri" w:hAnsi="Calibri"/>
-          <w:b w:val="0"/>
-          <w:sz w:val="22"/>
-        </w:rPr>
-        <w:t>Za osnovnu GUI provjeru ide se na Simulation -&gt; Run Simulation -&gt; Run Behavioral Simulation. Podrazumijevani scenario je Zbb demo, pa je ocekivana poruka u Tcl konzoli: Note: Zbb CPU demo test passed.</w:t>
-      </w:r>
-    </w:p>
-    <w:p>
-      <w:pPr>
-        <w:spacing w:before="0" w:after="60" w:line="240" w:lineRule="auto"/>
-      </w:pPr>
-      <w:r>
-        <w:rPr>
-          <w:rFonts w:ascii="Calibri" w:hAnsi="Calibri"/>
-          <w:b w:val="0"/>
-          <w:sz w:val="22"/>
-        </w:rPr>
-        <w:t>Za kompletan dokaz je prakticnije pokrenuti batch provjeru iz PowerShell-a: powershell -ExecutionPolicy Bypass -File .\scripts\run_vivado_checks.ps1 -Scenario all. Tada se jednim pokretanjem dobijaju sinteza, ALU test, Zbb demo, RV32I regresija i prosireni CPU demo.</w:t>
-      </w:r>
-    </w:p>
-    <w:p>
-      <w:pPr>
-        <w:spacing w:before="0" w:after="60" w:line="240" w:lineRule="auto"/>
-      </w:pPr>
-      <w:r>
-        <w:rPr>
-          <w:rFonts w:ascii="Calibri" w:hAnsi="Calibri"/>
-          <w:b w:val="0"/>
-          <w:sz w:val="22"/>
-        </w:rPr>
-        <w:t>Ako treba screenshot, najkorisnije je screenshotovati Tcl konzolu gdje se vide SYNTH_STATUS=synth_design Complete!, ALU extended tests passed, Zbb CPU demo test passed, rv32i regression CPU test passed, Extended CPU demo test passed i Vivado checks completed successfully.</w:t>
-      </w:r>
-    </w:p>
-    <w:p>
-      <w:pPr>
-        <w:spacing w:before="0" w:after="60" w:line="240" w:lineRule="auto"/>
-      </w:pPr>
-      <w:r>
-        <w:rPr>
-          <w:rFonts w:ascii="Calibri" w:hAnsi="Calibri"/>
-          <w:b w:val="0"/>
-          <w:sz w:val="22"/>
-        </w:rPr>
-        <w:t>Waveform screenshot nije neophodan za dokaz ispravnosti, jer testbench vec automatski poredi store adrese i podatke. Ako se ipak trazi vizuelni dodatak, u waveform treba dodati signale clk, reset, addrb_instr_32_s, instr_mem_cpu_s, wea_data_s, addra_data_32_s i dina_data_s, sa radix podesavanjem na hexadecimal.</w:t>
-      </w:r>
-    </w:p>
-    <w:p>
-      <w:pPr>
-        <w:spacing w:before="0" w:after="60" w:line="240" w:lineRule="auto"/>
-      </w:pPr>
-      <w:r>
-        <w:rPr>
-          <w:rFonts w:ascii="Calibri" w:hAnsi="Calibri"/>
-          <w:b w:val="0"/>
-          <w:sz w:val="22"/>
-        </w:rPr>
-        <w:t>Korisni primjeri za waveform su kraj Zbb demo scenarija, gdje se vidi store addr=0x00000044 data=0xFFFFF000, ili kraj prosirenog demo scenarija, gdje se vidi store addr=0x00000100 data=0x000000D6.</w:t>
-      </w:r>
-    </w:p>
-    <w:p>
-      <w:pPr>
-        <w:spacing w:before="0" w:after="60" w:line="240" w:lineRule="auto"/>
-      </w:pPr>
-      <w:r>
-        <w:rPr>
-          <w:rFonts w:ascii="Calibri" w:hAnsi="Calibri"/>
-          <w:b w:val="0"/>
-          <w:sz w:val="22"/>
-        </w:rPr>
-        <w:t>Detaljnije korak-po-korak uputstvo je sacuvano u output/vivado_uputstvo_za_pokretanje_2026-05-09.md.</w:t>
+        <w:t>Oznaka 1 prikazuje aktivan scenario i putanju programa. Oznaka 2 izdvaja RV32I ulaze i ocekivane rezultate. Oznaka 3 izdvaja Zbb rezultate, a oznaka 4 prosireni test. Testbench prati store operacije procesora i poredi dobijene adrese i podatke sa ovim ocekivanim nizovima.</w:t>
       </w:r>
     </w:p>
     <w:p>
       <w:pPr>
         <w:keepNext/>
-        <w:spacing w:before="0" w:after="60" w:line="240" w:lineRule="auto"/>
-        <w:rPr>
-          <w:rFonts w:hint="eastAsia"/>
-        </w:rPr>
+        <w:spacing w:after="60" w:line="240" w:lineRule="auto"/>
       </w:pPr>
       <w:r>
         <w:rPr>
@@ -3926,10 +3380,7 @@
     </w:p>
     <w:p>
       <w:pPr>
-        <w:spacing w:after="60" w:line="240" w:lineRule="auto" w:before="0"/>
-        <w:rPr>
-          <w:rFonts w:hint="eastAsia"/>
-        </w:rPr>
+        <w:spacing w:after="60" w:line="240" w:lineRule="auto"/>
       </w:pPr>
       <w:r>
         <w:rPr>
@@ -3939,8 +3390,8 @@
       </w:r>
     </w:p>
     <w:sectPr>
-      <w:headerReference w:type="default" r:id="rId8"/>
-      <w:footerReference w:type="default" r:id="rId9"/>
+      <w:headerReference w:type="default" r:id="rId10"/>
+      <w:footerReference w:type="default" r:id="rId11"/>
       <w:pgSz w:w="12240" w:h="15840"/>
       <w:pgMar w:top="1037" w:right="1123" w:bottom="1037" w:left="1123" w:header="720" w:footer="720" w:gutter="0"/>
       <w:cols w:space="720"/>
@@ -3956,9 +3407,6 @@
     <w:p>
       <w:pPr>
         <w:spacing w:after="0" w:line="240" w:lineRule="auto"/>
-        <w:rPr>
-          <w:rFonts w:hint="eastAsia"/>
-        </w:rPr>
       </w:pPr>
       <w:r>
         <w:separator/>
@@ -3969,9 +3417,6 @@
     <w:p>
       <w:pPr>
         <w:spacing w:after="0" w:line="240" w:lineRule="auto"/>
-        <w:rPr>
-          <w:rFonts w:hint="eastAsia"/>
-        </w:rPr>
       </w:pPr>
       <w:r>
         <w:continuationSeparator/>
@@ -3987,9 +3432,6 @@
     <w:pPr>
       <w:pStyle w:val="Footer"/>
       <w:jc w:val="center"/>
-      <w:rPr>
-        <w:rFonts w:hint="eastAsia"/>
-      </w:rPr>
     </w:pPr>
     <w:r>
       <w:rPr>
@@ -3997,54 +3439,8 @@
         <w:color w:val="5A5A5A"/>
         <w:sz w:val="18"/>
       </w:rPr>
-      <w:t xml:space="preserve">RV32IM </w:t>
+      <w:t>RV32IM single-cycle + Zbb dokumentacija</w:t>
     </w:r>
-    <w:proofErr w:type="gramStart"/>
-    <w:r>
-      <w:rPr>
-        <w:rFonts w:eastAsia="Georgia"/>
-        <w:color w:val="5A5A5A"/>
-        <w:sz w:val="18"/>
-      </w:rPr>
-      <w:t>single-cycle</w:t>
-    </w:r>
-    <w:proofErr w:type="gramEnd"/>
-    <w:r>
-      <w:rPr>
-        <w:rFonts w:eastAsia="Georgia"/>
-        <w:color w:val="5A5A5A"/>
-        <w:sz w:val="18"/>
-      </w:rPr>
-      <w:t xml:space="preserve"> + </w:t>
-    </w:r>
-    <w:proofErr w:type="spellStart"/>
-    <w:r>
-      <w:rPr>
-        <w:rFonts w:eastAsia="Georgia"/>
-        <w:color w:val="5A5A5A"/>
-        <w:sz w:val="18"/>
-      </w:rPr>
-      <w:t>Zbb</w:t>
-    </w:r>
-    <w:proofErr w:type="spellEnd"/>
-    <w:r>
-      <w:rPr>
-        <w:rFonts w:eastAsia="Georgia"/>
-        <w:color w:val="5A5A5A"/>
-        <w:sz w:val="18"/>
-      </w:rPr>
-      <w:t xml:space="preserve"> </w:t>
-    </w:r>
-    <w:proofErr w:type="spellStart"/>
-    <w:r>
-      <w:rPr>
-        <w:rFonts w:eastAsia="Georgia"/>
-        <w:color w:val="5A5A5A"/>
-        <w:sz w:val="18"/>
-      </w:rPr>
-      <w:t>dokumentacija</w:t>
-    </w:r>
-    <w:proofErr w:type="spellEnd"/>
   </w:p>
 </w:ftr>
 </file>
@@ -4055,9 +3451,6 @@
     <w:p>
       <w:pPr>
         <w:spacing w:after="0" w:line="240" w:lineRule="auto"/>
-        <w:rPr>
-          <w:rFonts w:hint="eastAsia"/>
-        </w:rPr>
       </w:pPr>
       <w:r>
         <w:separator/>
@@ -4068,9 +3461,6 @@
     <w:p>
       <w:pPr>
         <w:spacing w:after="0" w:line="240" w:lineRule="auto"/>
-        <w:rPr>
-          <w:rFonts w:hint="eastAsia"/>
-        </w:rPr>
       </w:pPr>
       <w:r>
         <w:continuationSeparator/>
@@ -4085,9 +3475,6 @@
   <w:p>
     <w:pPr>
       <w:pStyle w:val="Header"/>
-      <w:rPr>
-        <w:rFonts w:hint="eastAsia"/>
-      </w:rPr>
     </w:pPr>
   </w:p>
 </w:hdr>

</xml_diff>